<commit_message>
update the word file
</commit_message>
<xml_diff>
--- a/Shenteng_MA_20721362.docx
+++ b/Shenteng_MA_20721362.docx
@@ -2,505 +2,525 @@
 <file path=word/document.xml><?xml version="1.0" encoding="utf-8"?>
 <w:document xmlns:wpc="http://schemas.microsoft.com/office/word/2010/wordprocessingCanvas" xmlns:cx="http://schemas.microsoft.com/office/drawing/2014/chartex" xmlns:cx1="http://schemas.microsoft.com/office/drawing/2015/9/8/chartex" xmlns:cx2="http://schemas.microsoft.com/office/drawing/2015/10/21/chartex" xmlns:cx3="http://schemas.microsoft.com/office/drawing/2016/5/9/chartex" xmlns:cx4="http://schemas.microsoft.com/office/drawing/2016/5/10/chartex" xmlns:cx5="http://schemas.microsoft.com/office/drawing/2016/5/11/chartex" xmlns:cx6="http://schemas.microsoft.com/office/drawing/2016/5/12/chartex" xmlns:cx7="http://schemas.microsoft.com/office/drawing/2016/5/13/chartex" xmlns:cx8="http://schemas.microsoft.com/office/drawing/2016/5/14/chartex" xmlns:mc="http://schemas.openxmlformats.org/markup-compatibility/2006" xmlns:aink="http://schemas.microsoft.com/office/drawing/2016/ink" xmlns:am3d="http://schemas.microsoft.com/office/drawing/2017/model3d" xmlns:o="urn:schemas-microsoft-com:office:office" xmlns:oel="http://schemas.microsoft.com/office/2019/extlst" xmlns:r="http://schemas.openxmlformats.org/officeDocument/2006/relationships" xmlns:m="http://schemas.openxmlformats.org/officeDocument/2006/math" xmlns:v="urn:schemas-microsoft-com:vml" xmlns:wp14="http://schemas.microsoft.com/office/word/2010/wordprocessingDrawing" xmlns:wp="http://schemas.openxmlformats.org/drawingml/2006/wordprocessingDrawing" xmlns:w10="urn:schemas-microsoft-com:office:word" xmlns:w="http://schemas.openxmlformats.org/wordprocessingml/2006/main" xmlns:w14="http://schemas.microsoft.com/office/word/2010/wordml" xmlns:w15="http://schemas.microsoft.com/office/word/2012/wordml" xmlns:w16cex="http://schemas.microsoft.com/office/word/2018/wordml/cex" xmlns:w16cid="http://schemas.microsoft.com/office/word/2016/wordml/cid" xmlns:w16="http://schemas.microsoft.com/office/word/2018/wordml" xmlns:w16du="http://schemas.microsoft.com/office/word/2023/wordml/word16du" xmlns:w16sdtdh="http://schemas.microsoft.com/office/word/2020/wordml/sdtdatahash" xmlns:w16sdtfl="http://schemas.microsoft.com/office/word/2024/wordml/sdtformatlock" xmlns:w16se="http://schemas.microsoft.com/office/word/2015/wordml/symex" xmlns:wpg="http://schemas.microsoft.com/office/word/2010/wordprocessingGroup" xmlns:wpi="http://schemas.microsoft.com/office/word/2010/wordprocessingInk" xmlns:wne="http://schemas.microsoft.com/office/word/2006/wordml" xmlns:wps="http://schemas.microsoft.com/office/word/2010/wordprocessingShape" mc:Ignorable="w14 w15 w16se w16cid w16 w16cex w16sdtdh w16sdtfl w16du wp14">
   <w:body>
-    <w:p>
-      <w:pPr>
-        <w:jc w:val="center"/>
-      </w:pPr>
-      <w:r>
+    <w:p/>
+    <w:p/>
+    <w:p/>
+    <w:p/>
+    <w:p>
+      <w:pPr>
+        <w:pStyle w:val="a8"/>
+      </w:pPr>
+      <w:r>
+        <w:t>AERO1005 MATLAB Coursework 2</w:t>
+      </w:r>
+    </w:p>
+    <w:p/>
+    <w:p>
+      <w:pPr>
         <w:rPr>
           <w:b/>
-          <w:color w:val="1F4E79"/>
-          <w:sz w:val="40"/>
-        </w:rPr>
-        <w:t>AERO1005 MATLAB Coursework 2</w:t>
-      </w:r>
-    </w:p>
-    <w:p>
-      <w:pPr>
-        <w:jc w:val="center"/>
-      </w:pPr>
-      <w:r>
-        <w:rPr>
-          <w:i/>
+          <w:bCs/>
+        </w:rPr>
+      </w:pPr>
+      <w:r>
+        <w:rPr>
+          <w:b/>
+          <w:bCs/>
+        </w:rPr>
+        <w:t xml:space="preserve">Author: </w:t>
+      </w:r>
+      <w:r>
+        <w:rPr>
+          <w:b/>
+          <w:bCs/>
+        </w:rPr>
+        <w:t>Shenteng MA</w:t>
+      </w:r>
+    </w:p>
+    <w:p>
+      <w:pPr>
+        <w:rPr>
+          <w:b/>
+          <w:bCs/>
+        </w:rPr>
+      </w:pPr>
+      <w:r>
+        <w:rPr>
+          <w:b/>
+          <w:bCs/>
+        </w:rPr>
+        <w:t xml:space="preserve">Student ID: </w:t>
+      </w:r>
+      <w:r>
+        <w:rPr>
+          <w:b/>
+          <w:bCs/>
+        </w:rPr>
+        <w:t>20721362</w:t>
+      </w:r>
+    </w:p>
+    <w:p>
+      <w:pPr>
+        <w:rPr>
+          <w:b/>
+          <w:bCs/>
+        </w:rPr>
+      </w:pPr>
+      <w:r>
+        <w:rPr>
+          <w:b/>
+          <w:bCs/>
+        </w:rPr>
+        <w:t xml:space="preserve">Date of report: </w:t>
+      </w:r>
+      <w:r>
+        <w:rPr>
+          <w:b/>
+          <w:bCs/>
+        </w:rPr>
+        <w:t>Add submission date here</w:t>
+      </w:r>
+    </w:p>
+    <w:p>
+      <w:pPr>
+        <w:rPr>
+          <w:lang w:val="en-US" w:eastAsia="zh-CN"/>
+        </w:rPr>
+      </w:pPr>
+    </w:p>
+    <w:p/>
+    <w:p/>
+    <w:p>
+      <w:pPr>
+        <w:rPr>
+          <w:highlight w:val="cyan"/>
+        </w:rPr>
+      </w:pPr>
+    </w:p>
+    <w:p>
+      <w:pPr>
+        <w:rPr>
+          <w:highlight w:val="cyan"/>
+        </w:rPr>
+      </w:pPr>
+    </w:p>
+    <w:p>
+      <w:pPr>
+        <w:rPr>
+          <w:highlight w:val="cyan"/>
+        </w:rPr>
+      </w:pPr>
+    </w:p>
+    <w:p>
+      <w:pPr>
+        <w:rPr>
+          <w:highlight w:val="cyan"/>
+        </w:rPr>
+      </w:pPr>
+    </w:p>
+    <w:p>
+      <w:pPr>
+        <w:rPr>
+          <w:highlight w:val="cyan"/>
+        </w:rPr>
+      </w:pPr>
+    </w:p>
+    <w:p>
+      <w:pPr>
+        <w:rPr>
+          <w:highlight w:val="cyan"/>
+        </w:rPr>
+      </w:pPr>
+    </w:p>
+    <w:p>
+      <w:pPr>
+        <w:rPr>
+          <w:highlight w:val="cyan"/>
+        </w:rPr>
+      </w:pPr>
+    </w:p>
+    <w:p>
+      <w:pPr>
+        <w:rPr>
+          <w:highlight w:val="cyan"/>
+        </w:rPr>
+      </w:pPr>
+    </w:p>
+    <w:p>
+      <w:pPr>
+        <w:rPr>
+          <w:highlight w:val="cyan"/>
+        </w:rPr>
+      </w:pPr>
+    </w:p>
+    <w:p>
+      <w:pPr>
+        <w:rPr>
+          <w:highlight w:val="cyan"/>
+        </w:rPr>
+      </w:pPr>
+    </w:p>
+    <w:p>
+      <w:pPr>
+        <w:rPr>
+          <w:highlight w:val="cyan"/>
+        </w:rPr>
+      </w:pPr>
+    </w:p>
+    <w:p>
+      <w:pPr>
+        <w:rPr>
+          <w:highlight w:val="cyan"/>
+        </w:rPr>
+      </w:pPr>
+    </w:p>
+    <w:p>
+      <w:pPr>
+        <w:rPr>
+          <w:highlight w:val="cyan"/>
+        </w:rPr>
+      </w:pPr>
+    </w:p>
+    <w:p>
+      <w:pPr>
+        <w:rPr>
+          <w:highlight w:val="cyan"/>
+        </w:rPr>
+      </w:pPr>
+    </w:p>
+    <w:p>
+      <w:pPr>
+        <w:rPr>
+          <w:highlight w:val="cyan"/>
+        </w:rPr>
+      </w:pPr>
+    </w:p>
+    <w:p>
+      <w:pPr>
+        <w:rPr>
+          <w:highlight w:val="cyan"/>
+        </w:rPr>
+      </w:pPr>
+    </w:p>
+    <w:p>
+      <w:pPr>
+        <w:pStyle w:val="a0"/>
+        <w:numPr>
+          <w:ilvl w:val="0"/>
+          <w:numId w:val="5"/>
+        </w:numPr>
+        <w:rPr>
           <w:sz w:val="24"/>
-        </w:rPr>
-        <w:t>Solving Engineering Problems with a Programming Language</w:t>
-      </w:r>
-    </w:p>
-    <w:tbl>
-      <w:tblPr>
-        <w:tblStyle w:val="aa"/>
-        <w:tblW w:type="auto" w:w="0"/>
-        <w:jc w:val="center"/>
-        <w:tblLook w:firstColumn="1" w:firstRow="1" w:lastColumn="0" w:lastRow="0" w:noHBand="0" w:noVBand="1" w:val="04A0"/>
-      </w:tblPr>
-      <w:tblGrid>
-        <w:gridCol w:w="4819"/>
-        <w:gridCol w:w="4819"/>
-      </w:tblGrid>
-      <w:tr>
-        <w:tc>
-          <w:tcPr>
-            <w:tcW w:type="dxa" w:w="4819"/>
-            <w:shd w:fill="D9EAF7"/>
-            <w:vAlign w:val="center"/>
-          </w:tcPr>
-          <w:p>
-            <w:r/>
-            <w:r>
-              <w:rPr>
-                <w:b/>
-              </w:rPr>
-              <w:t>Author</w:t>
-            </w:r>
-          </w:p>
-        </w:tc>
-        <w:tc>
-          <w:tcPr>
-            <w:tcW w:type="dxa" w:w="4819"/>
-            <w:vAlign w:val="center"/>
-          </w:tcPr>
-          <w:p>
-            <w:r/>
-            <w:r>
-              <w:rPr>
-                <w:b w:val="0"/>
-              </w:rPr>
-              <w:t>Shenteng MA</w:t>
-            </w:r>
-          </w:p>
-        </w:tc>
-      </w:tr>
-      <w:tr>
-        <w:tc>
-          <w:tcPr>
-            <w:tcW w:type="dxa" w:w="4819"/>
-            <w:shd w:fill="D9EAF7"/>
-            <w:vAlign w:val="center"/>
-          </w:tcPr>
-          <w:p>
-            <w:r/>
-            <w:r>
-              <w:rPr>
-                <w:b/>
-              </w:rPr>
-              <w:t>Student ID</w:t>
-            </w:r>
-          </w:p>
-        </w:tc>
-        <w:tc>
-          <w:tcPr>
-            <w:tcW w:type="dxa" w:w="4819"/>
-            <w:vAlign w:val="center"/>
-          </w:tcPr>
-          <w:p>
-            <w:r/>
-            <w:r>
-              <w:rPr>
-                <w:b w:val="0"/>
-              </w:rPr>
-              <w:t>20721362</w:t>
-            </w:r>
-          </w:p>
-        </w:tc>
-      </w:tr>
-      <w:tr>
-        <w:tc>
-          <w:tcPr>
-            <w:tcW w:type="dxa" w:w="4819"/>
-            <w:shd w:fill="D9EAF7"/>
-            <w:vAlign w:val="center"/>
-          </w:tcPr>
-          <w:p>
-            <w:r/>
-            <w:r>
-              <w:rPr>
-                <w:b/>
-              </w:rPr>
-              <w:t>Date of report</w:t>
-            </w:r>
-          </w:p>
-        </w:tc>
-        <w:tc>
-          <w:tcPr>
-            <w:tcW w:type="dxa" w:w="4819"/>
-            <w:vAlign w:val="center"/>
-          </w:tcPr>
-          <w:p>
-            <w:r/>
-            <w:r>
-              <w:rPr>
-                <w:b w:val="0"/>
-              </w:rPr>
-              <w:t>18 April 2026</w:t>
-            </w:r>
-          </w:p>
-        </w:tc>
-      </w:tr>
-      <w:tr>
-        <w:tc>
-          <w:tcPr>
-            <w:tcW w:type="dxa" w:w="4819"/>
-            <w:shd w:fill="D9EAF7"/>
-            <w:vAlign w:val="center"/>
-          </w:tcPr>
-          <w:p>
-            <w:r/>
-            <w:r>
-              <w:rPr>
-                <w:b/>
-              </w:rPr>
-              <w:t>Main MATLAB script</w:t>
-            </w:r>
-          </w:p>
-        </w:tc>
-        <w:tc>
-          <w:tcPr>
-            <w:tcW w:type="dxa" w:w="4819"/>
-            <w:vAlign w:val="center"/>
-          </w:tcPr>
-          <w:p>
-            <w:r/>
-            <w:r>
-              <w:rPr>
-                <w:b w:val="0"/>
-              </w:rPr>
-              <w:t>Shenteng_MA_20721362.m</w:t>
-            </w:r>
-          </w:p>
-        </w:tc>
-      </w:tr>
-    </w:tbl>
-    <w:p/>
-    <w:p>
-      <w:pPr>
-        <w:pStyle w:val="1"/>
-      </w:pPr>
-      <w:r>
-        <w:t>Submission Overview</w:t>
-      </w:r>
-    </w:p>
-    <w:p>
-      <w:r>
-        <w:t>This document supports the MATLAB coursework submission for AERO1005 Coursework 2. The project monitors capsule temperature using an Arduino interface, logs the measured data, controls LED indicators, and predicts future temperature behaviour from recent readings.</w:t>
-      </w:r>
-    </w:p>
-    <w:tbl>
-      <w:tblPr>
-        <w:tblStyle w:val="aa"/>
-        <w:tblW w:type="auto" w:w="0"/>
-        <w:jc w:val="center"/>
-        <w:tblLook w:firstColumn="1" w:firstRow="1" w:lastColumn="0" w:lastRow="0" w:noHBand="0" w:noVBand="1" w:val="04A0"/>
-      </w:tblPr>
-      <w:tblGrid>
-        <w:gridCol w:w="3213"/>
-        <w:gridCol w:w="3213"/>
-        <w:gridCol w:w="3213"/>
-      </w:tblGrid>
-      <w:tr>
-        <w:tc>
-          <w:tcPr>
-            <w:tcW w:type="dxa" w:w="3213"/>
-            <w:shd w:fill="1F4E79"/>
-          </w:tcPr>
-          <w:p>
-            <w:r/>
-            <w:r>
-              <w:rPr>
-                <w:b/>
-                <w:color w:val="FFFFFF"/>
-              </w:rPr>
-              <w:t>File</w:t>
-            </w:r>
-          </w:p>
-        </w:tc>
-        <w:tc>
-          <w:tcPr>
-            <w:tcW w:type="dxa" w:w="3213"/>
-            <w:shd w:fill="1F4E79"/>
-          </w:tcPr>
-          <w:p>
-            <w:r/>
-            <w:r>
-              <w:rPr>
-                <w:b/>
-                <w:color w:val="FFFFFF"/>
-              </w:rPr>
-              <w:t>Purpose</w:t>
-            </w:r>
-          </w:p>
-        </w:tc>
-        <w:tc>
-          <w:tcPr>
-            <w:tcW w:type="dxa" w:w="3213"/>
-            <w:shd w:fill="1F4E79"/>
-          </w:tcPr>
-          <w:p>
-            <w:r/>
-            <w:r>
-              <w:rPr>
-                <w:b/>
-                <w:color w:val="FFFFFF"/>
-              </w:rPr>
-              <w:t>Status</w:t>
-            </w:r>
-          </w:p>
-        </w:tc>
-      </w:tr>
-      <w:tr>
-        <w:tc>
-          <w:tcPr>
-            <w:tcW w:type="dxa" w:w="3213"/>
-          </w:tcPr>
-          <w:p>
-            <w:r/>
-            <w:r>
-              <w:rPr>
-                <w:b w:val="0"/>
-              </w:rPr>
-              <w:t>Shenteng_MA_20721362.m</w:t>
-            </w:r>
-          </w:p>
-        </w:tc>
-        <w:tc>
-          <w:tcPr>
-            <w:tcW w:type="dxa" w:w="3213"/>
-          </w:tcPr>
-          <w:p>
-            <w:r/>
-            <w:r>
-              <w:rPr>
-                <w:b w:val="0"/>
-              </w:rPr>
-              <w:t>Main coursework script for preliminary task, Task 1, and calls to Task 2/3 functions.</w:t>
-            </w:r>
-          </w:p>
-        </w:tc>
-        <w:tc>
-          <w:tcPr>
-            <w:tcW w:type="dxa" w:w="3213"/>
-          </w:tcPr>
-          <w:p>
-            <w:r/>
-            <w:r>
-              <w:rPr>
-                <w:b w:val="0"/>
-              </w:rPr>
-              <w:t>Implemented</w:t>
-            </w:r>
-          </w:p>
-        </w:tc>
-      </w:tr>
-      <w:tr>
-        <w:tc>
-          <w:tcPr>
-            <w:tcW w:type="dxa" w:w="3213"/>
-          </w:tcPr>
-          <w:p>
-            <w:r/>
-            <w:r>
-              <w:rPr>
-                <w:b w:val="0"/>
-              </w:rPr>
-              <w:t>temp_monitor.m</w:t>
-            </w:r>
-          </w:p>
-        </w:tc>
-        <w:tc>
-          <w:tcPr>
-            <w:tcW w:type="dxa" w:w="3213"/>
-          </w:tcPr>
-          <w:p>
-            <w:r/>
-            <w:r>
-              <w:rPr>
-                <w:b w:val="0"/>
-              </w:rPr>
-              <w:t>Continuous live temperature monitor with green/yellow/red LED behaviour.</w:t>
-            </w:r>
-          </w:p>
-        </w:tc>
-        <w:tc>
-          <w:tcPr>
-            <w:tcW w:type="dxa" w:w="3213"/>
-          </w:tcPr>
-          <w:p>
-            <w:r/>
-            <w:r>
-              <w:rPr>
-                <w:b w:val="0"/>
-              </w:rPr>
-              <w:t>Implemented</w:t>
-            </w:r>
-          </w:p>
-        </w:tc>
-      </w:tr>
-      <w:tr>
-        <w:tc>
-          <w:tcPr>
-            <w:tcW w:type="dxa" w:w="3213"/>
-          </w:tcPr>
-          <w:p>
-            <w:r/>
-            <w:r>
-              <w:rPr>
-                <w:b w:val="0"/>
-              </w:rPr>
-              <w:t>temp_prediction.m</w:t>
-            </w:r>
-          </w:p>
-        </w:tc>
-        <w:tc>
-          <w:tcPr>
-            <w:tcW w:type="dxa" w:w="3213"/>
-          </w:tcPr>
-          <w:p>
-            <w:r/>
-            <w:r>
-              <w:rPr>
-                <w:b w:val="0"/>
-              </w:rPr>
-              <w:t>Temperature rate estimation, five-minute prediction, and warning LEDs.</w:t>
-            </w:r>
-          </w:p>
-        </w:tc>
-        <w:tc>
-          <w:tcPr>
-            <w:tcW w:type="dxa" w:w="3213"/>
-          </w:tcPr>
-          <w:p>
-            <w:r/>
-            <w:r>
-              <w:rPr>
-                <w:b w:val="0"/>
-              </w:rPr>
-              <w:t>Implemented</w:t>
-            </w:r>
-          </w:p>
-        </w:tc>
-      </w:tr>
-      <w:tr>
-        <w:tc>
-          <w:tcPr>
-            <w:tcW w:type="dxa" w:w="3213"/>
-          </w:tcPr>
-          <w:p>
-            <w:r/>
-            <w:r>
-              <w:rPr>
-                <w:b w:val="0"/>
-              </w:rPr>
-              <w:t>capsule_temperature.txt</w:t>
-            </w:r>
-          </w:p>
-        </w:tc>
-        <w:tc>
-          <w:tcPr>
-            <w:tcW w:type="dxa" w:w="3213"/>
-          </w:tcPr>
-          <w:p>
-            <w:r/>
-            <w:r>
-              <w:rPr>
-                <w:b w:val="0"/>
-              </w:rPr>
-              <w:t>Task 1 formatted temperature log output.</w:t>
-            </w:r>
-          </w:p>
-        </w:tc>
-        <w:tc>
-          <w:tcPr>
-            <w:tcW w:type="dxa" w:w="3213"/>
-          </w:tcPr>
-          <w:p>
-            <w:r/>
-            <w:r>
-              <w:rPr>
-                <w:b w:val="0"/>
-              </w:rPr>
-              <w:t>Generated</w:t>
-            </w:r>
-          </w:p>
-        </w:tc>
-      </w:tr>
-    </w:tbl>
-    <w:p>
-      <w:pPr>
-        <w:pStyle w:val="1"/>
-      </w:pPr>
-      <w:r>
-        <w:t>Preliminary Task - Arduino and Git Installation</w:t>
-      </w:r>
-    </w:p>
-    <w:p>
-      <w:r>
-        <w:t>The local working folder is linked to a GitHub repository and contains the hidden .git folder. The main MATLAB script establishes communication with an Arduino Uno through the arduino() object. A preliminary LED blink loop was implemented using writeDigitalPin and pause commands to confirm MATLAB-Arduino communication.</w:t>
-      </w:r>
-    </w:p>
-    <w:p>
-      <w:pPr>
-        <w:pStyle w:val="1"/>
-      </w:pPr>
-      <w:r>
-        <w:t>Task 1 - Temperature Data, Plot, and Log File</w:t>
-      </w:r>
-    </w:p>
-    <w:p>
-      <w:r>
-        <w:t>The temperature sensor is read from analogue pin A0. The script records approximately one reading per second for 600 seconds, converts voltage to temperature using the MCP9700A constants, calculates minimum, maximum, and average temperature, and writes the formatted output to capsule_temperature.txt.</w:t>
-      </w:r>
-    </w:p>
-    <w:tbl>
-      <w:tblPr>
-        <w:tblW w:type="auto" w:w="0"/>
-        <w:jc w:val="center"/>
-        <w:tblLook w:firstColumn="1" w:firstRow="1" w:lastColumn="0" w:lastRow="0" w:noHBand="0" w:noVBand="1" w:val="04A0"/>
-      </w:tblPr>
-      <w:tblGrid>
-        <w:gridCol w:w="9638"/>
-      </w:tblGrid>
-      <w:tr>
-        <w:tc>
-          <w:tcPr>
-            <w:tcW w:type="dxa" w:w="9638"/>
-            <w:shd w:fill="FFF2CC"/>
-          </w:tcPr>
-          <w:p>
-            <w:r>
-              <w:rPr>
-                <w:b/>
-              </w:rPr>
-              <w:t>Photograph required</w:t>
-            </w:r>
-            <w:r>
-              <w:br/>
-              <w:t>Insert the Task 1 breadboard photograph here before final submission. The local folder does not currently contain a hardware photograph.</w:t>
-            </w:r>
-          </w:p>
-        </w:tc>
-      </w:tr>
-    </w:tbl>
-    <w:p>
-      <w:pPr>
-        <w:jc w:val="center"/>
-      </w:pPr>
-      <w:r>
+          <w:szCs w:val="24"/>
+          <w:highlight w:val="cyan"/>
+          <w:lang w:val="en-US" w:eastAsia="zh-CN"/>
+        </w:rPr>
+      </w:pPr>
+      <w:r>
+        <w:rPr>
+          <w:sz w:val="24"/>
+          <w:szCs w:val="24"/>
+          <w:highlight w:val="cyan"/>
+          <w:lang w:val="en-US" w:eastAsia="zh-CN"/>
+        </w:rPr>
+        <w:lastRenderedPageBreak/>
+        <w:t>Preliminary Task – Arduino and Git Installation</w:t>
+      </w:r>
+    </w:p>
+    <w:p>
+      <w:pPr>
+        <w:jc w:val="both"/>
+        <w:rPr>
+          <w:highlight w:val="cyan"/>
+          <w:lang w:val="en-US" w:eastAsia="zh-CN"/>
+        </w:rPr>
+      </w:pPr>
+      <w:r>
+        <w:t xml:space="preserve">The local working folder is linked to a GitHub repository and contains the </w:t>
+      </w:r>
+      <w:proofErr w:type="gramStart"/>
+      <w:r>
+        <w:t>hidden .git</w:t>
+      </w:r>
+      <w:proofErr w:type="gramEnd"/>
+      <w:r>
+        <w:t xml:space="preserve"> folder. The main MATLAB script establishes communication with an Arduino Uno through the </w:t>
+      </w:r>
+      <w:proofErr w:type="spellStart"/>
+      <w:proofErr w:type="gramStart"/>
+      <w:r>
+        <w:t>arduino</w:t>
+      </w:r>
+      <w:proofErr w:type="spellEnd"/>
+      <w:r>
+        <w:t>(</w:t>
+      </w:r>
+      <w:proofErr w:type="gramEnd"/>
+      <w:r>
+        <w:t xml:space="preserve">) object. A preliminary LED blink loop was implemented using </w:t>
+      </w:r>
+      <w:proofErr w:type="spellStart"/>
+      <w:r>
+        <w:t>writeDigitalPin</w:t>
+      </w:r>
+      <w:proofErr w:type="spellEnd"/>
+      <w:r>
+        <w:t xml:space="preserve"> and pause commands to confirm MATLAB-Arduino communication</w:t>
+      </w:r>
+    </w:p>
+    <w:p>
+      <w:pPr>
+        <w:pStyle w:val="a0"/>
+        <w:numPr>
+          <w:ilvl w:val="0"/>
+          <w:numId w:val="5"/>
+        </w:numPr>
+        <w:rPr>
+          <w:sz w:val="24"/>
+          <w:szCs w:val="24"/>
+          <w:highlight w:val="cyan"/>
+          <w:lang w:val="en-US" w:eastAsia="zh-CN"/>
+        </w:rPr>
+      </w:pPr>
+      <w:r>
+        <w:rPr>
+          <w:sz w:val="24"/>
+          <w:szCs w:val="24"/>
+          <w:highlight w:val="cyan"/>
+          <w:lang w:val="en-US" w:eastAsia="zh-CN"/>
+        </w:rPr>
+        <w:t>Task 1 – Temperature Data, Plot, and Log File</w:t>
+      </w:r>
+    </w:p>
+    <w:p>
+      <w:r>
+        <w:rPr>
+          <w:noProof/>
+        </w:rPr>
+        <mc:AlternateContent>
+          <mc:Choice Requires="wps">
+            <w:drawing>
+              <wp:anchor distT="0" distB="0" distL="114300" distR="114300" simplePos="0" relativeHeight="251660288" behindDoc="0" locked="0" layoutInCell="1" allowOverlap="1" wp14:anchorId="52A59EAB" wp14:editId="162D7EC1">
+                <wp:simplePos x="0" y="0"/>
+                <wp:positionH relativeFrom="column">
+                  <wp:posOffset>609600</wp:posOffset>
+                </wp:positionH>
+                <wp:positionV relativeFrom="paragraph">
+                  <wp:posOffset>6843395</wp:posOffset>
+                </wp:positionV>
+                <wp:extent cx="4438650" cy="635"/>
+                <wp:effectExtent l="0" t="0" r="6350" b="12065"/>
+                <wp:wrapTopAndBottom/>
+                <wp:docPr id="588831033" name="文本框 1"/>
+                <wp:cNvGraphicFramePr/>
+                <a:graphic xmlns:a="http://schemas.openxmlformats.org/drawingml/2006/main">
+                  <a:graphicData uri="http://schemas.microsoft.com/office/word/2010/wordprocessingShape">
+                    <wps:wsp>
+                      <wps:cNvSpPr txBox="1"/>
+                      <wps:spPr>
+                        <a:xfrm>
+                          <a:off x="0" y="0"/>
+                          <a:ext cx="4438650" cy="635"/>
+                        </a:xfrm>
+                        <a:prstGeom prst="rect">
+                          <a:avLst/>
+                        </a:prstGeom>
+                        <a:solidFill>
+                          <a:prstClr val="white"/>
+                        </a:solidFill>
+                        <a:ln>
+                          <a:noFill/>
+                        </a:ln>
+                      </wps:spPr>
+                      <wps:txbx>
+                        <w:txbxContent>
+                          <w:p>
+                            <w:pPr>
+                              <w:pStyle w:val="ac"/>
+                              <w:rPr>
+                                <w:noProof/>
+                                <w:color w:val="808080" w:themeColor="background1" w:themeShade="80"/>
+                                <w:sz w:val="28"/>
+                                <w:szCs w:val="28"/>
+                              </w:rPr>
+                            </w:pPr>
+                            <w:r>
+                              <w:t xml:space="preserve">Figure </w:t>
+                            </w:r>
+                            <w:fldSimple w:instr=" SEQ Figure \* ARABIC ">
+                              <w:r>
+                                <w:rPr>
+                                  <w:noProof/>
+                                </w:rPr>
+                                <w:t>1</w:t>
+                              </w:r>
+                            </w:fldSimple>
+                            <w:r>
+                              <w:t xml:space="preserve"> Task 1 Breadboard Photograph</w:t>
+                            </w:r>
+                          </w:p>
+                        </w:txbxContent>
+                      </wps:txbx>
+                      <wps:bodyPr rot="0" spcFirstLastPara="0" vertOverflow="overflow" horzOverflow="overflow" vert="horz" wrap="square" lIns="0" tIns="0" rIns="0" bIns="0" numCol="1" spcCol="0" rtlCol="0" fromWordArt="0" anchor="t" anchorCtr="0" forceAA="0" compatLnSpc="1">
+                        <a:prstTxWarp prst="textNoShape">
+                          <a:avLst/>
+                        </a:prstTxWarp>
+                        <a:spAutoFit/>
+                      </wps:bodyPr>
+                    </wps:wsp>
+                  </a:graphicData>
+                </a:graphic>
+              </wp:anchor>
+            </w:drawing>
+          </mc:Choice>
+          <mc:Fallback>
+            <w:pict>
+              <v:shapetype w14:anchorId="52A59EAB" id="_x0000_t202" coordsize="21600,21600" o:spt="202" path="m,l,21600r21600,l21600,xe">
+                <v:stroke joinstyle="miter"/>
+                <v:path gradientshapeok="t" o:connecttype="rect"/>
+              </v:shapetype>
+              <v:shape id="文本框 1" o:spid="_x0000_s1026" type="#_x0000_t202" style="position:absolute;margin-left:48pt;margin-top:538.85pt;width:349.5pt;height:.05pt;z-index:251660288;visibility:visible;mso-wrap-style:square;mso-wrap-distance-left:9pt;mso-wrap-distance-top:0;mso-wrap-distance-right:9pt;mso-wrap-distance-bottom:0;mso-position-horizontal:absolute;mso-position-horizontal-relative:text;mso-position-vertical:absolute;mso-position-vertical-relative:text;v-text-anchor:top" o:gfxdata="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" stroked="f">
+                <v:textbox style="mso-fit-shape-to-text:t" inset="0,0,0,0">
+                  <w:txbxContent>
+                    <w:p>
+                      <w:pPr>
+                        <w:pStyle w:val="ac"/>
+                        <w:rPr>
+                          <w:noProof/>
+                          <w:color w:val="808080" w:themeColor="background1" w:themeShade="80"/>
+                          <w:sz w:val="28"/>
+                          <w:szCs w:val="28"/>
+                        </w:rPr>
+                      </w:pPr>
+                      <w:r>
+                        <w:t xml:space="preserve">Figure </w:t>
+                      </w:r>
+                      <w:fldSimple w:instr=" SEQ Figure \* ARABIC ">
+                        <w:r>
+                          <w:rPr>
+                            <w:noProof/>
+                          </w:rPr>
+                          <w:t>1</w:t>
+                        </w:r>
+                      </w:fldSimple>
+                      <w:r>
+                        <w:t xml:space="preserve"> Task 1 Breadboard Photograph</w:t>
+                      </w:r>
+                    </w:p>
+                  </w:txbxContent>
+                </v:textbox>
+                <w10:wrap type="topAndBottom"/>
+              </v:shape>
+            </w:pict>
+          </mc:Fallback>
+        </mc:AlternateContent>
+      </w:r>
+      <w:r>
+        <w:rPr>
+          <w:rFonts w:hint="eastAsia"/>
+          <w:noProof/>
+          <w:color w:val="808080" w:themeColor="background1" w:themeShade="80"/>
+          <w:sz w:val="28"/>
+          <w:szCs w:val="28"/>
+          <w:lang w:eastAsia="zh-CN"/>
+        </w:rPr>
         <w:drawing>
-          <wp:inline xmlns:a="http://schemas.openxmlformats.org/drawingml/2006/main" xmlns:pic="http://schemas.openxmlformats.org/drawingml/2006/picture">
-            <wp:extent cx="5580000" cy="3364522"/>
-            <wp:docPr id="1" name="Picture 1"/>
+          <wp:anchor distT="0" distB="0" distL="114300" distR="114300" simplePos="0" relativeHeight="251658240" behindDoc="0" locked="0" layoutInCell="1" allowOverlap="1" wp14:anchorId="45935CC9" wp14:editId="447DE7AB">
+            <wp:simplePos x="0" y="0"/>
+            <wp:positionH relativeFrom="column">
+              <wp:posOffset>-130810</wp:posOffset>
+            </wp:positionH>
+            <wp:positionV relativeFrom="paragraph">
+              <wp:posOffset>1607185</wp:posOffset>
+            </wp:positionV>
+            <wp:extent cx="5919470" cy="4438650"/>
+            <wp:effectExtent l="3810" t="0" r="2540" b="2540"/>
+            <wp:wrapTopAndBottom/>
+            <wp:docPr id="62432737" name="图片 3"/>
             <wp:cNvGraphicFramePr>
-              <a:graphicFrameLocks noChangeAspect="1"/>
+              <a:graphicFrameLocks xmlns:a="http://schemas.openxmlformats.org/drawingml/2006/main" noChangeAspect="1"/>
             </wp:cNvGraphicFramePr>
-            <a:graphic>
+            <a:graphic xmlns:a="http://schemas.openxmlformats.org/drawingml/2006/main">
               <a:graphicData uri="http://schemas.openxmlformats.org/drawingml/2006/picture">
-                <pic:pic>
+                <pic:pic xmlns:pic="http://schemas.openxmlformats.org/drawingml/2006/picture">
                   <pic:nvPicPr>
-                    <pic:cNvPr id="0" name="task1_temperature_plot.png"/>
+                    <pic:cNvPr id="62432737" name="图片 62432737"/>
                     <pic:cNvPicPr/>
                   </pic:nvPicPr>
                   <pic:blipFill>
-                    <a:blip r:embed="rId14"/>
+                    <a:blip r:embed="rId8" cstate="print">
+                      <a:extLst>
+                        <a:ext uri="{28A0092B-C50C-407E-A947-70E740481C1C}">
+                          <a14:useLocalDpi xmlns:a14="http://schemas.microsoft.com/office/drawing/2010/main" val="0"/>
+                        </a:ext>
+                      </a:extLst>
+                    </a:blip>
+                    <a:stretch>
+                      <a:fillRect/>
+                    </a:stretch>
+                  </pic:blipFill>
+                  <pic:spPr>
+                    <a:xfrm rot="5400000">
+                      <a:off x="0" y="0"/>
+                      <a:ext cx="5919470" cy="4438650"/>
+                    </a:xfrm>
+                    <a:prstGeom prst="rect">
+                      <a:avLst/>
+                    </a:prstGeom>
+                  </pic:spPr>
+                </pic:pic>
+              </a:graphicData>
+            </a:graphic>
+            <wp14:sizeRelH relativeFrom="margin">
+              <wp14:pctWidth>0</wp14:pctWidth>
+            </wp14:sizeRelH>
+            <wp14:sizeRelV relativeFrom="margin">
+              <wp14:pctHeight>0</wp14:pctHeight>
+            </wp14:sizeRelV>
+          </wp:anchor>
+        </w:drawing>
+      </w:r>
+      <w:r>
+        <w:t>The temperature sensor is read from analogue pin A0. The script records approximately one reading per second for 600 seconds, converts voltage to temperature using the MCP9700A constants, calculates minimum, maximum, and average temperature, and writes the formatted output to capsule_temperature.txt.</w:t>
+      </w:r>
+    </w:p>
+    <w:p>
+      <w:r>
+        <w:lastRenderedPageBreak/>
+        <w:t>1</w:t>
+      </w:r>
+    </w:p>
+    <w:p>
+      <w:pPr>
+        <w:keepNext/>
+      </w:pPr>
+      <w:r>
+        <w:rPr>
+          <w:noProof/>
+        </w:rPr>
+        <w:drawing>
+          <wp:inline distT="0" distB="0" distL="0" distR="0" wp14:anchorId="619C74F4" wp14:editId="677311C7">
+            <wp:extent cx="5731510" cy="3456305"/>
+            <wp:effectExtent l="0" t="0" r="0" b="0"/>
+            <wp:docPr id="924434136" name="图片 3" descr="图表&#10;&#10;AI 生成的内容可能不正确。"/>
+            <wp:cNvGraphicFramePr>
+              <a:graphicFrameLocks xmlns:a="http://schemas.openxmlformats.org/drawingml/2006/main" noChangeAspect="1"/>
+            </wp:cNvGraphicFramePr>
+            <a:graphic xmlns:a="http://schemas.openxmlformats.org/drawingml/2006/main">
+              <a:graphicData uri="http://schemas.openxmlformats.org/drawingml/2006/picture">
+                <pic:pic xmlns:pic="http://schemas.openxmlformats.org/drawingml/2006/picture">
+                  <pic:nvPicPr>
+                    <pic:cNvPr id="924434136" name="图片 3" descr="图表&#10;&#10;AI 生成的内容可能不正确。"/>
+                    <pic:cNvPicPr/>
+                  </pic:nvPicPr>
+                  <pic:blipFill>
+                    <a:blip r:embed="rId9" cstate="print">
+                      <a:extLst>
+                        <a:ext uri="{28A0092B-C50C-407E-A947-70E740481C1C}">
+                          <a14:useLocalDpi xmlns:a14="http://schemas.microsoft.com/office/drawing/2010/main" val="0"/>
+                        </a:ext>
+                      </a:extLst>
+                    </a:blip>
                     <a:stretch>
                       <a:fillRect/>
                     </a:stretch>
@@ -508,9 +528,11 @@
                   <pic:spPr>
                     <a:xfrm>
                       <a:off x="0" y="0"/>
-                      <a:ext cx="5580000" cy="3364522"/>
+                      <a:ext cx="5731510" cy="3456305"/>
                     </a:xfrm>
-                    <a:prstGeom prst="rect"/>
+                    <a:prstGeom prst="rect">
+                      <a:avLst/>
+                    </a:prstGeom>
                   </pic:spPr>
                 </pic:pic>
               </a:graphicData>
@@ -521,170 +543,894 @@
     </w:p>
     <w:p>
       <w:pPr>
-        <w:jc w:val="center"/>
-      </w:pPr>
-      <w:r>
-        <w:rPr>
-          <w:i/>
-          <w:color w:val="595959"/>
-          <w:sz w:val="18"/>
-        </w:rPr>
-        <w:t>Figure 1. Time-temperature plot generated from the 10-minute temperature recording.</w:t>
-      </w:r>
-    </w:p>
-    <w:p>
-      <w:pPr>
-        <w:pStyle w:val="2"/>
-      </w:pPr>
-      <w:r>
-        <w:t>Task 1 Log File Extract</w:t>
-      </w:r>
-    </w:p>
-    <w:p>
-      <w:r>
-        <w:rPr>
-          <w:rFonts w:ascii="Consolas" w:hAnsi="Consolas" w:eastAsia="Consolas"/>
+        <w:pStyle w:val="ac"/>
+      </w:pPr>
+      <w:r>
+        <w:t xml:space="preserve">Figure </w:t>
+      </w:r>
+      <w:fldSimple w:instr=" SEQ Figure \* ARABIC ">
+        <w:r>
+          <w:rPr>
+            <w:noProof/>
+          </w:rPr>
+          <w:t>2</w:t>
+        </w:r>
+      </w:fldSimple>
+      <w:r>
+        <w:t>Time-temperature Plot</w:t>
+      </w:r>
+    </w:p>
+    <w:p>
+      <w:r>
+        <w:t>T</w:t>
+      </w:r>
+      <w:r>
+        <w:t>ask 1 Log file Extract:</w:t>
+      </w:r>
+    </w:p>
+    <w:p>
+      <w:pPr>
+        <w:rPr>
+          <w:rFonts w:ascii="Consolas" w:eastAsia="Consolas" w:hAnsi="Consolas"/>
+          <w:sz w:val="18"/>
+        </w:rPr>
+      </w:pPr>
+      <w:r>
+        <w:rPr>
+          <w:rFonts w:ascii="Consolas" w:eastAsia="Consolas" w:hAnsi="Consolas"/>
           <w:sz w:val="18"/>
         </w:rPr>
         <w:t>Data logging initiated - 17-Apr-2026 00:24:57</w:t>
+      </w:r>
+      <w:r>
+        <w:rPr>
+          <w:rFonts w:ascii="Consolas" w:eastAsia="Consolas" w:hAnsi="Consolas"/>
+          <w:sz w:val="18"/>
+        </w:rPr>
         <w:br/>
         <w:t>Location - Capsule</w:t>
+      </w:r>
+      <w:r>
+        <w:rPr>
+          <w:rFonts w:ascii="Consolas" w:eastAsia="Consolas" w:hAnsi="Consolas"/>
+          <w:sz w:val="18"/>
+        </w:rPr>
         <w:br/>
+      </w:r>
+      <w:r>
+        <w:rPr>
+          <w:rFonts w:ascii="Consolas" w:eastAsia="Consolas" w:hAnsi="Consolas"/>
+          <w:sz w:val="18"/>
+        </w:rPr>
         <w:br/>
         <w:t>Minute 0</w:t>
+      </w:r>
+      <w:r>
+        <w:rPr>
+          <w:rFonts w:ascii="Consolas" w:eastAsia="Consolas" w:hAnsi="Consolas"/>
+          <w:sz w:val="18"/>
+        </w:rPr>
         <w:br/>
-        <w:t>Temperature: 20.87 degC</w:t>
+        <w:t xml:space="preserve">Temperature: 20.87 </w:t>
+      </w:r>
+      <w:proofErr w:type="spellStart"/>
+      <w:r>
+        <w:rPr>
+          <w:rFonts w:ascii="Consolas" w:eastAsia="Consolas" w:hAnsi="Consolas"/>
+          <w:sz w:val="18"/>
+        </w:rPr>
+        <w:t>degC</w:t>
+      </w:r>
+      <w:proofErr w:type="spellEnd"/>
+      <w:r>
+        <w:rPr>
+          <w:rFonts w:ascii="Consolas" w:eastAsia="Consolas" w:hAnsi="Consolas"/>
+          <w:sz w:val="18"/>
+        </w:rPr>
         <w:br/>
+      </w:r>
+      <w:r>
+        <w:rPr>
+          <w:rFonts w:ascii="Consolas" w:eastAsia="Consolas" w:hAnsi="Consolas"/>
+          <w:sz w:val="18"/>
+        </w:rPr>
         <w:br/>
         <w:t>Minute 1</w:t>
+      </w:r>
+      <w:r>
+        <w:rPr>
+          <w:rFonts w:ascii="Consolas" w:eastAsia="Consolas" w:hAnsi="Consolas"/>
+          <w:sz w:val="18"/>
+        </w:rPr>
         <w:br/>
-        <w:t>Temperature: 20.87 degC</w:t>
+        <w:t xml:space="preserve">Temperature: 20.87 </w:t>
+      </w:r>
+      <w:proofErr w:type="spellStart"/>
+      <w:r>
+        <w:rPr>
+          <w:rFonts w:ascii="Consolas" w:eastAsia="Consolas" w:hAnsi="Consolas"/>
+          <w:sz w:val="18"/>
+        </w:rPr>
+        <w:t>degC</w:t>
+      </w:r>
+      <w:proofErr w:type="spellEnd"/>
+      <w:r>
+        <w:rPr>
+          <w:rFonts w:ascii="Consolas" w:eastAsia="Consolas" w:hAnsi="Consolas"/>
+          <w:sz w:val="18"/>
+        </w:rPr>
         <w:br/>
+      </w:r>
+      <w:r>
+        <w:rPr>
+          <w:rFonts w:ascii="Consolas" w:eastAsia="Consolas" w:hAnsi="Consolas"/>
+          <w:sz w:val="18"/>
+        </w:rPr>
         <w:br/>
         <w:t>Minute 2</w:t>
+      </w:r>
+      <w:r>
+        <w:rPr>
+          <w:rFonts w:ascii="Consolas" w:eastAsia="Consolas" w:hAnsi="Consolas"/>
+          <w:sz w:val="18"/>
+        </w:rPr>
         <w:br/>
-        <w:t>Temperature: 19.40 degC</w:t>
+        <w:t xml:space="preserve">Temperature: 19.40 </w:t>
+      </w:r>
+      <w:proofErr w:type="spellStart"/>
+      <w:r>
+        <w:rPr>
+          <w:rFonts w:ascii="Consolas" w:eastAsia="Consolas" w:hAnsi="Consolas"/>
+          <w:sz w:val="18"/>
+        </w:rPr>
+        <w:t>degC</w:t>
+      </w:r>
+      <w:proofErr w:type="spellEnd"/>
+      <w:r>
+        <w:rPr>
+          <w:rFonts w:ascii="Consolas" w:eastAsia="Consolas" w:hAnsi="Consolas"/>
+          <w:sz w:val="18"/>
+        </w:rPr>
         <w:br/>
+      </w:r>
+      <w:r>
+        <w:rPr>
+          <w:rFonts w:ascii="Consolas" w:eastAsia="Consolas" w:hAnsi="Consolas"/>
+          <w:sz w:val="18"/>
+        </w:rPr>
         <w:br/>
         <w:t>Minute 3</w:t>
+      </w:r>
+      <w:r>
+        <w:rPr>
+          <w:rFonts w:ascii="Consolas" w:eastAsia="Consolas" w:hAnsi="Consolas"/>
+          <w:sz w:val="18"/>
+        </w:rPr>
         <w:br/>
-        <w:t>Temperature: 19.89 degC</w:t>
+        <w:t xml:space="preserve">Temperature: 19.89 </w:t>
+      </w:r>
+      <w:proofErr w:type="spellStart"/>
+      <w:r>
+        <w:rPr>
+          <w:rFonts w:ascii="Consolas" w:eastAsia="Consolas" w:hAnsi="Consolas"/>
+          <w:sz w:val="18"/>
+        </w:rPr>
+        <w:t>degC</w:t>
+      </w:r>
+      <w:proofErr w:type="spellEnd"/>
+      <w:r>
+        <w:rPr>
+          <w:rFonts w:ascii="Consolas" w:eastAsia="Consolas" w:hAnsi="Consolas"/>
+          <w:sz w:val="18"/>
+        </w:rPr>
         <w:br/>
+      </w:r>
+      <w:r>
+        <w:rPr>
+          <w:rFonts w:ascii="Consolas" w:eastAsia="Consolas" w:hAnsi="Consolas"/>
+          <w:sz w:val="18"/>
+        </w:rPr>
         <w:br/>
         <w:t>Minute 4</w:t>
+      </w:r>
+      <w:r>
+        <w:rPr>
+          <w:rFonts w:ascii="Consolas" w:eastAsia="Consolas" w:hAnsi="Consolas"/>
+          <w:sz w:val="18"/>
+        </w:rPr>
         <w:br/>
-        <w:t>Temperature: 19.40 degC</w:t>
+        <w:t xml:space="preserve">Temperature: 19.40 </w:t>
+      </w:r>
+      <w:proofErr w:type="spellStart"/>
+      <w:r>
+        <w:rPr>
+          <w:rFonts w:ascii="Consolas" w:eastAsia="Consolas" w:hAnsi="Consolas"/>
+          <w:sz w:val="18"/>
+        </w:rPr>
+        <w:t>degC</w:t>
+      </w:r>
+      <w:proofErr w:type="spellEnd"/>
+      <w:r>
+        <w:rPr>
+          <w:rFonts w:ascii="Consolas" w:eastAsia="Consolas" w:hAnsi="Consolas"/>
+          <w:sz w:val="18"/>
+        </w:rPr>
         <w:br/>
+      </w:r>
+      <w:r>
+        <w:rPr>
+          <w:rFonts w:ascii="Consolas" w:eastAsia="Consolas" w:hAnsi="Consolas"/>
+          <w:sz w:val="18"/>
+        </w:rPr>
         <w:br/>
         <w:t>Minute 5</w:t>
+      </w:r>
+      <w:r>
+        <w:rPr>
+          <w:rFonts w:ascii="Consolas" w:eastAsia="Consolas" w:hAnsi="Consolas"/>
+          <w:sz w:val="18"/>
+        </w:rPr>
         <w:br/>
-        <w:t>Temperature: 19.40 degC</w:t>
+        <w:t xml:space="preserve">Temperature: 19.40 </w:t>
+      </w:r>
+      <w:proofErr w:type="spellStart"/>
+      <w:r>
+        <w:rPr>
+          <w:rFonts w:ascii="Consolas" w:eastAsia="Consolas" w:hAnsi="Consolas"/>
+          <w:sz w:val="18"/>
+        </w:rPr>
+        <w:t>degC</w:t>
+      </w:r>
+      <w:proofErr w:type="spellEnd"/>
+      <w:r>
+        <w:rPr>
+          <w:rFonts w:ascii="Consolas" w:eastAsia="Consolas" w:hAnsi="Consolas"/>
+          <w:sz w:val="18"/>
+        </w:rPr>
         <w:br/>
+      </w:r>
+      <w:r>
+        <w:rPr>
+          <w:rFonts w:ascii="Consolas" w:eastAsia="Consolas" w:hAnsi="Consolas"/>
+          <w:sz w:val="18"/>
+        </w:rPr>
         <w:br/>
         <w:t>Minute 6</w:t>
+      </w:r>
+      <w:r>
+        <w:rPr>
+          <w:rFonts w:ascii="Consolas" w:eastAsia="Consolas" w:hAnsi="Consolas"/>
+          <w:sz w:val="18"/>
+        </w:rPr>
         <w:br/>
-        <w:t>Temperature: 19.40 degC</w:t>
+        <w:t xml:space="preserve">Temperature: 19.40 </w:t>
+      </w:r>
+      <w:proofErr w:type="spellStart"/>
+      <w:r>
+        <w:rPr>
+          <w:rFonts w:ascii="Consolas" w:eastAsia="Consolas" w:hAnsi="Consolas"/>
+          <w:sz w:val="18"/>
+        </w:rPr>
+        <w:t>deg</w:t>
+      </w:r>
+      <w:proofErr w:type="spellEnd"/>
+    </w:p>
+    <w:p>
+      <w:pPr>
+        <w:rPr>
+          <w:rFonts w:ascii="Consolas" w:eastAsia="Consolas" w:hAnsi="Consolas"/>
+          <w:sz w:val="18"/>
+        </w:rPr>
+      </w:pPr>
+      <w:r>
+        <w:rPr>
+          <w:rFonts w:ascii="Consolas" w:eastAsia="Consolas" w:hAnsi="Consolas"/>
+          <w:sz w:val="18"/>
+        </w:rPr>
+        <w:t>Minute 7</w:t>
+      </w:r>
+    </w:p>
+    <w:p>
+      <w:pPr>
+        <w:rPr>
+          <w:rFonts w:ascii="Consolas" w:eastAsia="Consolas" w:hAnsi="Consolas"/>
+          <w:sz w:val="18"/>
+        </w:rPr>
+      </w:pPr>
+      <w:r>
+        <w:rPr>
+          <w:rFonts w:ascii="Consolas" w:eastAsia="Consolas" w:hAnsi="Consolas"/>
+          <w:sz w:val="18"/>
+        </w:rPr>
+        <w:lastRenderedPageBreak/>
+        <w:t xml:space="preserve">Temperature: 18.91 </w:t>
+      </w:r>
+      <w:proofErr w:type="spellStart"/>
+      <w:r>
+        <w:rPr>
+          <w:rFonts w:ascii="Consolas" w:eastAsia="Consolas" w:hAnsi="Consolas"/>
+          <w:sz w:val="18"/>
+        </w:rPr>
+        <w:t>degC</w:t>
+      </w:r>
+      <w:proofErr w:type="spellEnd"/>
+      <w:r>
+        <w:rPr>
+          <w:rFonts w:ascii="Consolas" w:eastAsia="Consolas" w:hAnsi="Consolas"/>
+          <w:sz w:val="18"/>
+        </w:rPr>
         <w:br/>
-        <w:br/>
-        <w:t>Minute 7</w:t>
-        <w:br/>
-        <w:t>Temperature: 18.91 degC</w:t>
-        <w:br/>
+      </w:r>
+      <w:r>
+        <w:rPr>
+          <w:rFonts w:ascii="Consolas" w:eastAsia="Consolas" w:hAnsi="Consolas"/>
+          <w:sz w:val="18"/>
+        </w:rPr>
         <w:br/>
         <w:t>Minute 8</w:t>
+      </w:r>
+      <w:r>
+        <w:rPr>
+          <w:rFonts w:ascii="Consolas" w:eastAsia="Consolas" w:hAnsi="Consolas"/>
+          <w:sz w:val="18"/>
+        </w:rPr>
         <w:br/>
-        <w:t>Temperature: 18.91 degC</w:t>
+        <w:t xml:space="preserve">Temperature: 18.91 </w:t>
+      </w:r>
+      <w:proofErr w:type="spellStart"/>
+      <w:r>
+        <w:rPr>
+          <w:rFonts w:ascii="Consolas" w:eastAsia="Consolas" w:hAnsi="Consolas"/>
+          <w:sz w:val="18"/>
+        </w:rPr>
+        <w:t>degC</w:t>
+      </w:r>
+      <w:proofErr w:type="spellEnd"/>
+      <w:r>
+        <w:rPr>
+          <w:rFonts w:ascii="Consolas" w:eastAsia="Consolas" w:hAnsi="Consolas"/>
+          <w:sz w:val="18"/>
+        </w:rPr>
         <w:br/>
+      </w:r>
+      <w:r>
+        <w:rPr>
+          <w:rFonts w:ascii="Consolas" w:eastAsia="Consolas" w:hAnsi="Consolas"/>
+          <w:sz w:val="18"/>
+        </w:rPr>
         <w:br/>
         <w:t>Minute 9</w:t>
+      </w:r>
+      <w:r>
+        <w:rPr>
+          <w:rFonts w:ascii="Consolas" w:eastAsia="Consolas" w:hAnsi="Consolas"/>
+          <w:sz w:val="18"/>
+        </w:rPr>
         <w:br/>
-        <w:t>Temperature: 19.40 degC</w:t>
+        <w:t xml:space="preserve">Temperature: 19.40 </w:t>
+      </w:r>
+      <w:proofErr w:type="spellStart"/>
+      <w:r>
+        <w:rPr>
+          <w:rFonts w:ascii="Consolas" w:eastAsia="Consolas" w:hAnsi="Consolas"/>
+          <w:sz w:val="18"/>
+        </w:rPr>
+        <w:t>degC</w:t>
+      </w:r>
+      <w:proofErr w:type="spellEnd"/>
+      <w:r>
+        <w:rPr>
+          <w:rFonts w:ascii="Consolas" w:eastAsia="Consolas" w:hAnsi="Consolas"/>
+          <w:sz w:val="18"/>
+        </w:rPr>
         <w:br/>
+      </w:r>
+      <w:r>
+        <w:rPr>
+          <w:rFonts w:ascii="Consolas" w:eastAsia="Consolas" w:hAnsi="Consolas"/>
+          <w:sz w:val="18"/>
+        </w:rPr>
         <w:br/>
         <w:t>Minute 10</w:t>
+      </w:r>
+      <w:r>
+        <w:rPr>
+          <w:rFonts w:ascii="Consolas" w:eastAsia="Consolas" w:hAnsi="Consolas"/>
+          <w:sz w:val="18"/>
+        </w:rPr>
         <w:br/>
-        <w:t>Temperature: 20.38 degC</w:t>
+        <w:t xml:space="preserve">Temperature: 20.38 </w:t>
+      </w:r>
+      <w:proofErr w:type="spellStart"/>
+      <w:r>
+        <w:rPr>
+          <w:rFonts w:ascii="Consolas" w:eastAsia="Consolas" w:hAnsi="Consolas"/>
+          <w:sz w:val="18"/>
+        </w:rPr>
+        <w:t>degC</w:t>
+      </w:r>
+      <w:proofErr w:type="spellEnd"/>
+      <w:r>
+        <w:rPr>
+          <w:rFonts w:ascii="Consolas" w:eastAsia="Consolas" w:hAnsi="Consolas"/>
+          <w:sz w:val="18"/>
+        </w:rPr>
         <w:br/>
+      </w:r>
+      <w:r>
+        <w:rPr>
+          <w:rFonts w:ascii="Consolas" w:eastAsia="Consolas" w:hAnsi="Consolas"/>
+          <w:sz w:val="18"/>
+        </w:rPr>
         <w:br/>
         <w:t>Max temp</w:t>
+      </w:r>
+      <w:r>
+        <w:rPr>
+          <w:rFonts w:ascii="Consolas" w:eastAsia="Consolas" w:hAnsi="Consolas"/>
+          <w:sz w:val="18"/>
+        </w:rPr>
         <w:tab/>
-        <w:t>23.31 degC</w:t>
+        <w:t xml:space="preserve">23.31 </w:t>
+      </w:r>
+      <w:proofErr w:type="spellStart"/>
+      <w:r>
+        <w:rPr>
+          <w:rFonts w:ascii="Consolas" w:eastAsia="Consolas" w:hAnsi="Consolas"/>
+          <w:sz w:val="18"/>
+        </w:rPr>
+        <w:t>degC</w:t>
+      </w:r>
+      <w:proofErr w:type="spellEnd"/>
+      <w:r>
+        <w:rPr>
+          <w:rFonts w:ascii="Consolas" w:eastAsia="Consolas" w:hAnsi="Consolas"/>
+          <w:sz w:val="18"/>
+        </w:rPr>
         <w:br/>
         <w:t>Min temp</w:t>
+      </w:r>
+      <w:r>
+        <w:rPr>
+          <w:rFonts w:ascii="Consolas" w:eastAsia="Consolas" w:hAnsi="Consolas"/>
+          <w:sz w:val="18"/>
+        </w:rPr>
         <w:tab/>
-        <w:t>18.91 degC</w:t>
+        <w:t xml:space="preserve">18.91 </w:t>
+      </w:r>
+      <w:proofErr w:type="spellStart"/>
+      <w:r>
+        <w:rPr>
+          <w:rFonts w:ascii="Consolas" w:eastAsia="Consolas" w:hAnsi="Consolas"/>
+          <w:sz w:val="18"/>
+        </w:rPr>
+        <w:t>degC</w:t>
+      </w:r>
+      <w:proofErr w:type="spellEnd"/>
+      <w:r>
+        <w:rPr>
+          <w:rFonts w:ascii="Consolas" w:eastAsia="Consolas" w:hAnsi="Consolas"/>
+          <w:sz w:val="18"/>
+        </w:rPr>
         <w:br/>
         <w:t>Average temp</w:t>
+      </w:r>
+      <w:r>
+        <w:rPr>
+          <w:rFonts w:ascii="Consolas" w:eastAsia="Consolas" w:hAnsi="Consolas"/>
+          <w:sz w:val="18"/>
+        </w:rPr>
         <w:tab/>
-        <w:t>19.75 degC</w:t>
+        <w:t xml:space="preserve">19.75 </w:t>
+      </w:r>
+      <w:proofErr w:type="spellStart"/>
+      <w:r>
+        <w:rPr>
+          <w:rFonts w:ascii="Consolas" w:eastAsia="Consolas" w:hAnsi="Consolas"/>
+          <w:sz w:val="18"/>
+        </w:rPr>
+        <w:t>degC</w:t>
+      </w:r>
+      <w:proofErr w:type="spellEnd"/>
+      <w:r>
+        <w:rPr>
+          <w:rFonts w:ascii="Consolas" w:eastAsia="Consolas" w:hAnsi="Consolas"/>
+          <w:sz w:val="18"/>
+        </w:rPr>
         <w:br/>
         <w:t>Data logging terminated</w:t>
       </w:r>
     </w:p>
     <w:p>
       <w:pPr>
-        <w:pStyle w:val="1"/>
-      </w:pPr>
-      <w:r>
-        <w:t>Task 2 - LED Temperature Monitoring Device</w:t>
-      </w:r>
-    </w:p>
-    <w:p>
-      <w:r>
-        <w:t>The function temp_monitor.m continuously reads the temperature, updates a live graph, and controls the LEDs according to the comfort range. Green remains on for 18-24 C, yellow blinks below 18 C, and red blinks above 24 C. The red branch uses two 0.25 s ON/OFF blinks per loop so the data acquisition cycle remains close to one second.</w:t>
-      </w:r>
-    </w:p>
-    <w:tbl>
-      <w:tblPr>
-        <w:tblW w:type="auto" w:w="0"/>
-        <w:jc w:val="center"/>
-        <w:tblLook w:firstColumn="1" w:firstRow="1" w:lastColumn="0" w:lastRow="0" w:noHBand="0" w:noVBand="1" w:val="04A0"/>
-      </w:tblPr>
-      <w:tblGrid>
-        <w:gridCol w:w="9638"/>
-      </w:tblGrid>
-      <w:tr>
-        <w:tc>
-          <w:tcPr>
-            <w:tcW w:type="dxa" w:w="9638"/>
-            <w:shd w:fill="FFF2CC"/>
-          </w:tcPr>
-          <w:p>
-            <w:r>
-              <w:rPr>
-                <w:b/>
-              </w:rPr>
-              <w:t>Photograph required</w:t>
-            </w:r>
-            <w:r>
-              <w:br/>
-              <w:t>Insert the Task 2 three-LED breadboard photograph here before final submission. The local folder does not currently contain a hardware photograph.</w:t>
-            </w:r>
-          </w:p>
-        </w:tc>
-      </w:tr>
-    </w:tbl>
-    <w:p>
-      <w:pPr>
-        <w:jc w:val="center"/>
-      </w:pPr>
-      <w:r>
+        <w:pStyle w:val="a0"/>
+        <w:numPr>
+          <w:ilvl w:val="0"/>
+          <w:numId w:val="5"/>
+        </w:numPr>
+        <w:rPr>
+          <w:sz w:val="24"/>
+          <w:szCs w:val="24"/>
+          <w:highlight w:val="cyan"/>
+          <w:lang w:val="en-US" w:eastAsia="zh-CN"/>
+        </w:rPr>
+      </w:pPr>
+      <w:r>
+        <w:rPr>
+          <w:sz w:val="24"/>
+          <w:szCs w:val="24"/>
+          <w:highlight w:val="cyan"/>
+          <w:lang w:val="en-US" w:eastAsia="zh-CN"/>
+        </w:rPr>
+        <w:t xml:space="preserve">Task </w:t>
+      </w:r>
+      <w:r>
+        <w:rPr>
+          <w:sz w:val="24"/>
+          <w:szCs w:val="24"/>
+          <w:highlight w:val="cyan"/>
+          <w:lang w:val="en-US" w:eastAsia="zh-CN"/>
+        </w:rPr>
+        <w:t>2 – LED Temperature Monitoring Device</w:t>
+      </w:r>
+    </w:p>
+    <w:p>
+      <w:pPr>
+        <w:rPr>
+          <w:color w:val="808080" w:themeColor="background1" w:themeShade="80"/>
+          <w:sz w:val="28"/>
+          <w:szCs w:val="28"/>
+          <w:lang w:val="en-US" w:eastAsia="zh-CN"/>
+        </w:rPr>
+      </w:pPr>
+      <w:r>
+        <w:rPr>
+          <w:noProof/>
+        </w:rPr>
+        <mc:AlternateContent>
+          <mc:Choice Requires="wps">
+            <w:drawing>
+              <wp:anchor distT="0" distB="0" distL="114300" distR="114300" simplePos="0" relativeHeight="251663360" behindDoc="0" locked="0" layoutInCell="1" allowOverlap="1" wp14:anchorId="25632F6E" wp14:editId="1C330628">
+                <wp:simplePos x="0" y="0"/>
+                <wp:positionH relativeFrom="column">
+                  <wp:posOffset>991870</wp:posOffset>
+                </wp:positionH>
+                <wp:positionV relativeFrom="paragraph">
+                  <wp:posOffset>5495290</wp:posOffset>
+                </wp:positionV>
+                <wp:extent cx="3844925" cy="635"/>
+                <wp:effectExtent l="0" t="0" r="3175" b="4445"/>
+                <wp:wrapTopAndBottom/>
+                <wp:docPr id="17667513" name="文本框 1"/>
+                <wp:cNvGraphicFramePr/>
+                <a:graphic xmlns:a="http://schemas.openxmlformats.org/drawingml/2006/main">
+                  <a:graphicData uri="http://schemas.microsoft.com/office/word/2010/wordprocessingShape">
+                    <wps:wsp>
+                      <wps:cNvSpPr txBox="1"/>
+                      <wps:spPr>
+                        <a:xfrm>
+                          <a:off x="0" y="0"/>
+                          <a:ext cx="3844925" cy="635"/>
+                        </a:xfrm>
+                        <a:prstGeom prst="rect">
+                          <a:avLst/>
+                        </a:prstGeom>
+                        <a:solidFill>
+                          <a:prstClr val="white"/>
+                        </a:solidFill>
+                        <a:ln>
+                          <a:noFill/>
+                        </a:ln>
+                      </wps:spPr>
+                      <wps:txbx>
+                        <w:txbxContent>
+                          <w:p>
+                            <w:pPr>
+                              <w:pStyle w:val="ac"/>
+                              <w:rPr>
+                                <w:noProof/>
+                                <w:color w:val="000000" w:themeColor="text1"/>
+                              </w:rPr>
+                            </w:pPr>
+                            <w:r>
+                              <w:t xml:space="preserve">Figure </w:t>
+                            </w:r>
+                            <w:fldSimple w:instr=" SEQ Figure \* ARABIC ">
+                              <w:r>
+                                <w:rPr>
+                                  <w:noProof/>
+                                </w:rPr>
+                                <w:t>3</w:t>
+                              </w:r>
+                            </w:fldSimple>
+                            <w:r>
+                              <w:t xml:space="preserve"> Task 2 Breadboard Photograph</w:t>
+                            </w:r>
+                          </w:p>
+                        </w:txbxContent>
+                      </wps:txbx>
+                      <wps:bodyPr rot="0" spcFirstLastPara="0" vertOverflow="overflow" horzOverflow="overflow" vert="horz" wrap="square" lIns="0" tIns="0" rIns="0" bIns="0" numCol="1" spcCol="0" rtlCol="0" fromWordArt="0" anchor="t" anchorCtr="0" forceAA="0" compatLnSpc="1">
+                        <a:prstTxWarp prst="textNoShape">
+                          <a:avLst/>
+                        </a:prstTxWarp>
+                        <a:spAutoFit/>
+                      </wps:bodyPr>
+                    </wps:wsp>
+                  </a:graphicData>
+                </a:graphic>
+              </wp:anchor>
+            </w:drawing>
+          </mc:Choice>
+          <mc:Fallback>
+            <w:pict>
+              <v:shape w14:anchorId="25632F6E" id="_x0000_s1027" type="#_x0000_t202" style="position:absolute;margin-left:78.1pt;margin-top:432.7pt;width:302.75pt;height:.05pt;z-index:251663360;visibility:visible;mso-wrap-style:square;mso-wrap-distance-left:9pt;mso-wrap-distance-top:0;mso-wrap-distance-right:9pt;mso-wrap-distance-bottom:0;mso-position-horizontal:absolute;mso-position-horizontal-relative:text;mso-position-vertical:absolute;mso-position-vertical-relative:text;v-text-anchor:top" o:gfxdata="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" stroked="f">
+                <v:textbox style="mso-fit-shape-to-text:t" inset="0,0,0,0">
+                  <w:txbxContent>
+                    <w:p>
+                      <w:pPr>
+                        <w:pStyle w:val="ac"/>
+                        <w:rPr>
+                          <w:noProof/>
+                          <w:color w:val="000000" w:themeColor="text1"/>
+                        </w:rPr>
+                      </w:pPr>
+                      <w:r>
+                        <w:t xml:space="preserve">Figure </w:t>
+                      </w:r>
+                      <w:fldSimple w:instr=" SEQ Figure \* ARABIC ">
+                        <w:r>
+                          <w:rPr>
+                            <w:noProof/>
+                          </w:rPr>
+                          <w:t>3</w:t>
+                        </w:r>
+                      </w:fldSimple>
+                      <w:r>
+                        <w:t xml:space="preserve"> Task 2 Breadboard Photograph</w:t>
+                      </w:r>
+                    </w:p>
+                  </w:txbxContent>
+                </v:textbox>
+                <w10:wrap type="topAndBottom"/>
+              </v:shape>
+            </w:pict>
+          </mc:Fallback>
+        </mc:AlternateContent>
+      </w:r>
+      <w:r>
+        <w:rPr>
+          <w:noProof/>
+          <w:color w:val="000000" w:themeColor="text1"/>
+        </w:rPr>
         <w:drawing>
-          <wp:inline xmlns:a="http://schemas.openxmlformats.org/drawingml/2006/main" xmlns:pic="http://schemas.openxmlformats.org/drawingml/2006/picture">
-            <wp:extent cx="4680000" cy="5940000"/>
-            <wp:docPr id="2" name="Picture 2"/>
+          <wp:anchor distT="0" distB="0" distL="114300" distR="114300" simplePos="0" relativeHeight="251661312" behindDoc="0" locked="0" layoutInCell="1" allowOverlap="1" wp14:anchorId="01897F99" wp14:editId="7A217306">
+            <wp:simplePos x="0" y="0"/>
+            <wp:positionH relativeFrom="column">
+              <wp:posOffset>524510</wp:posOffset>
+            </wp:positionH>
+            <wp:positionV relativeFrom="paragraph">
+              <wp:posOffset>1125855</wp:posOffset>
+            </wp:positionV>
+            <wp:extent cx="4780280" cy="3844925"/>
+            <wp:effectExtent l="0" t="2223" r="5398" b="5397"/>
+            <wp:wrapTopAndBottom/>
+            <wp:docPr id="18018575" name="图片 4" descr="图片包含 桌子, 电路, 游戏机, 电脑&#10;&#10;AI 生成的内容可能不正确。"/>
             <wp:cNvGraphicFramePr>
-              <a:graphicFrameLocks noChangeAspect="1"/>
+              <a:graphicFrameLocks xmlns:a="http://schemas.openxmlformats.org/drawingml/2006/main" noChangeAspect="1"/>
             </wp:cNvGraphicFramePr>
-            <a:graphic>
+            <a:graphic xmlns:a="http://schemas.openxmlformats.org/drawingml/2006/main">
               <a:graphicData uri="http://schemas.openxmlformats.org/drawingml/2006/picture">
-                <pic:pic>
+                <pic:pic xmlns:pic="http://schemas.openxmlformats.org/drawingml/2006/picture">
                   <pic:nvPicPr>
-                    <pic:cNvPr id="0" name="Task2_FlowChart_1.png"/>
+                    <pic:cNvPr id="18018575" name="图片 4" descr="图片包含 桌子, 电路, 游戏机, 电脑&#10;&#10;AI 生成的内容可能不正确。"/>
                     <pic:cNvPicPr/>
                   </pic:nvPicPr>
                   <pic:blipFill>
-                    <a:blip r:embed="rId15"/>
+                    <a:blip r:embed="rId10" cstate="print">
+                      <a:extLst>
+                        <a:ext uri="{28A0092B-C50C-407E-A947-70E740481C1C}">
+                          <a14:useLocalDpi xmlns:a14="http://schemas.microsoft.com/office/drawing/2010/main" val="0"/>
+                        </a:ext>
+                      </a:extLst>
+                    </a:blip>
+                    <a:stretch>
+                      <a:fillRect/>
+                    </a:stretch>
+                  </pic:blipFill>
+                  <pic:spPr>
+                    <a:xfrm rot="5400000">
+                      <a:off x="0" y="0"/>
+                      <a:ext cx="4780280" cy="3844925"/>
+                    </a:xfrm>
+                    <a:prstGeom prst="rect">
+                      <a:avLst/>
+                    </a:prstGeom>
+                  </pic:spPr>
+                </pic:pic>
+              </a:graphicData>
+            </a:graphic>
+            <wp14:sizeRelH relativeFrom="margin">
+              <wp14:pctWidth>0</wp14:pctWidth>
+            </wp14:sizeRelH>
+            <wp14:sizeRelV relativeFrom="margin">
+              <wp14:pctHeight>0</wp14:pctHeight>
+            </wp14:sizeRelV>
+          </wp:anchor>
+        </w:drawing>
+      </w:r>
+      <w:r>
+        <w:t xml:space="preserve">The function </w:t>
+      </w:r>
+      <w:proofErr w:type="spellStart"/>
+      <w:r>
+        <w:t>temp_monitor.m</w:t>
+      </w:r>
+      <w:proofErr w:type="spellEnd"/>
+      <w:r>
+        <w:t xml:space="preserve"> continuously reads the temperature, updates a live graph, and controls the LEDs according to the comfort range. Green remains on for 18-24 C, yellow blinks below 18 C, and red blinks above 24 C.</w:t>
+      </w:r>
+    </w:p>
+    <w:p>
+      <w:pPr>
+        <w:spacing w:line="259" w:lineRule="auto"/>
+        <w:jc w:val="both"/>
+        <w:rPr>
+          <w:color w:val="000000" w:themeColor="text1"/>
+          <w:highlight w:val="cyan"/>
+          <w:lang w:val="en-US" w:eastAsia="zh-CN"/>
+        </w:rPr>
+      </w:pPr>
+      <w:r>
+        <w:rPr>
+          <w:noProof/>
+        </w:rPr>
+        <w:lastRenderedPageBreak/>
+        <mc:AlternateContent>
+          <mc:Choice Requires="wps">
+            <w:drawing>
+              <wp:anchor distT="0" distB="0" distL="114300" distR="114300" simplePos="0" relativeHeight="251666432" behindDoc="0" locked="0" layoutInCell="1" allowOverlap="1" wp14:anchorId="56D5EBAF" wp14:editId="382BD00B">
+                <wp:simplePos x="0" y="0"/>
+                <wp:positionH relativeFrom="column">
+                  <wp:posOffset>237490</wp:posOffset>
+                </wp:positionH>
+                <wp:positionV relativeFrom="paragraph">
+                  <wp:posOffset>6984009</wp:posOffset>
+                </wp:positionV>
+                <wp:extent cx="5327015" cy="635"/>
+                <wp:effectExtent l="0" t="0" r="0" b="12065"/>
+                <wp:wrapTopAndBottom/>
+                <wp:docPr id="1786592046" name="文本框 1"/>
+                <wp:cNvGraphicFramePr/>
+                <a:graphic xmlns:a="http://schemas.openxmlformats.org/drawingml/2006/main">
+                  <a:graphicData uri="http://schemas.microsoft.com/office/word/2010/wordprocessingShape">
+                    <wps:wsp>
+                      <wps:cNvSpPr txBox="1"/>
+                      <wps:spPr>
+                        <a:xfrm>
+                          <a:off x="0" y="0"/>
+                          <a:ext cx="5327015" cy="635"/>
+                        </a:xfrm>
+                        <a:prstGeom prst="rect">
+                          <a:avLst/>
+                        </a:prstGeom>
+                        <a:solidFill>
+                          <a:prstClr val="white"/>
+                        </a:solidFill>
+                        <a:ln>
+                          <a:noFill/>
+                        </a:ln>
+                      </wps:spPr>
+                      <wps:txbx>
+                        <w:txbxContent>
+                          <w:p>
+                            <w:pPr>
+                              <w:pStyle w:val="ac"/>
+                              <w:rPr>
+                                <w:noProof/>
+                                <w:color w:val="000000" w:themeColor="text1"/>
+                              </w:rPr>
+                            </w:pPr>
+                            <w:r>
+                              <w:t xml:space="preserve">Figure </w:t>
+                            </w:r>
+                            <w:fldSimple w:instr=" SEQ Figure \* ARABIC ">
+                              <w:r>
+                                <w:rPr>
+                                  <w:noProof/>
+                                </w:rPr>
+                                <w:t>4</w:t>
+                              </w:r>
+                            </w:fldSimple>
+                            <w:r>
+                              <w:t xml:space="preserve"> Task 2 Flowchart 1</w:t>
+                            </w:r>
+                          </w:p>
+                        </w:txbxContent>
+                      </wps:txbx>
+                      <wps:bodyPr rot="0" spcFirstLastPara="0" vertOverflow="overflow" horzOverflow="overflow" vert="horz" wrap="square" lIns="0" tIns="0" rIns="0" bIns="0" numCol="1" spcCol="0" rtlCol="0" fromWordArt="0" anchor="t" anchorCtr="0" forceAA="0" compatLnSpc="1">
+                        <a:prstTxWarp prst="textNoShape">
+                          <a:avLst/>
+                        </a:prstTxWarp>
+                        <a:spAutoFit/>
+                      </wps:bodyPr>
+                    </wps:wsp>
+                  </a:graphicData>
+                </a:graphic>
+              </wp:anchor>
+            </w:drawing>
+          </mc:Choice>
+          <mc:Fallback>
+            <w:pict>
+              <v:shape w14:anchorId="56D5EBAF" id="_x0000_s1028" type="#_x0000_t202" style="position:absolute;left:0;text-align:left;margin-left:18.7pt;margin-top:549.9pt;width:419.45pt;height:.05pt;z-index:251666432;visibility:visible;mso-wrap-style:square;mso-wrap-distance-left:9pt;mso-wrap-distance-top:0;mso-wrap-distance-right:9pt;mso-wrap-distance-bottom:0;mso-position-horizontal:absolute;mso-position-horizontal-relative:text;mso-position-vertical:absolute;mso-position-vertical-relative:text;v-text-anchor:top" o:gfxdata="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" stroked="f">
+                <v:textbox style="mso-fit-shape-to-text:t" inset="0,0,0,0">
+                  <w:txbxContent>
+                    <w:p>
+                      <w:pPr>
+                        <w:pStyle w:val="ac"/>
+                        <w:rPr>
+                          <w:noProof/>
+                          <w:color w:val="000000" w:themeColor="text1"/>
+                        </w:rPr>
+                      </w:pPr>
+                      <w:r>
+                        <w:t xml:space="preserve">Figure </w:t>
+                      </w:r>
+                      <w:fldSimple w:instr=" SEQ Figure \* ARABIC ">
+                        <w:r>
+                          <w:rPr>
+                            <w:noProof/>
+                          </w:rPr>
+                          <w:t>4</w:t>
+                        </w:r>
+                      </w:fldSimple>
+                      <w:r>
+                        <w:t xml:space="preserve"> Task 2 Flowchart 1</w:t>
+                      </w:r>
+                    </w:p>
+                  </w:txbxContent>
+                </v:textbox>
+                <w10:wrap type="topAndBottom"/>
+              </v:shape>
+            </w:pict>
+          </mc:Fallback>
+        </mc:AlternateContent>
+      </w:r>
+      <w:r>
+        <w:rPr>
+          <w:noProof/>
+          <w:color w:val="000000" w:themeColor="text1"/>
+        </w:rPr>
+        <w:drawing>
+          <wp:anchor distT="0" distB="0" distL="114300" distR="114300" simplePos="0" relativeHeight="251664384" behindDoc="0" locked="0" layoutInCell="1" allowOverlap="1" wp14:anchorId="39C1E508" wp14:editId="44ACCE62">
+            <wp:simplePos x="0" y="0"/>
+            <wp:positionH relativeFrom="column">
+              <wp:posOffset>237490</wp:posOffset>
+            </wp:positionH>
+            <wp:positionV relativeFrom="paragraph">
+              <wp:posOffset>0</wp:posOffset>
+            </wp:positionV>
+            <wp:extent cx="5426075" cy="6889115"/>
+            <wp:effectExtent l="0" t="0" r="0" b="0"/>
+            <wp:wrapTopAndBottom/>
+            <wp:docPr id="661593" name="图片 4"/>
+            <wp:cNvGraphicFramePr>
+              <a:graphicFrameLocks xmlns:a="http://schemas.openxmlformats.org/drawingml/2006/main" noChangeAspect="1"/>
+            </wp:cNvGraphicFramePr>
+            <a:graphic xmlns:a="http://schemas.openxmlformats.org/drawingml/2006/main">
+              <a:graphicData uri="http://schemas.openxmlformats.org/drawingml/2006/picture">
+                <pic:pic xmlns:pic="http://schemas.openxmlformats.org/drawingml/2006/picture">
+                  <pic:nvPicPr>
+                    <pic:cNvPr id="661593" name="图片 661593"/>
+                    <pic:cNvPicPr/>
+                  </pic:nvPicPr>
+                  <pic:blipFill>
+                    <a:blip r:embed="rId11" cstate="print">
+                      <a:extLst>
+                        <a:ext uri="{28A0092B-C50C-407E-A947-70E740481C1C}">
+                          <a14:useLocalDpi xmlns:a14="http://schemas.microsoft.com/office/drawing/2010/main" val="0"/>
+                        </a:ext>
+                      </a:extLst>
+                    </a:blip>
                     <a:stretch>
                       <a:fillRect/>
                     </a:stretch>
@@ -692,56 +1438,246 @@
                   <pic:spPr>
                     <a:xfrm>
                       <a:off x="0" y="0"/>
-                      <a:ext cx="4680000" cy="5940000"/>
+                      <a:ext cx="5426075" cy="6889115"/>
                     </a:xfrm>
-                    <a:prstGeom prst="rect"/>
+                    <a:prstGeom prst="rect">
+                      <a:avLst/>
+                    </a:prstGeom>
                   </pic:spPr>
                 </pic:pic>
               </a:graphicData>
             </a:graphic>
-          </wp:inline>
+            <wp14:sizeRelH relativeFrom="margin">
+              <wp14:pctWidth>0</wp14:pctWidth>
+            </wp14:sizeRelH>
+            <wp14:sizeRelV relativeFrom="margin">
+              <wp14:pctHeight>0</wp14:pctHeight>
+            </wp14:sizeRelV>
+          </wp:anchor>
         </w:drawing>
       </w:r>
     </w:p>
     <w:p>
       <w:pPr>
-        <w:jc w:val="center"/>
-      </w:pPr>
-      <w:r>
-        <w:rPr>
-          <w:i/>
-          <w:color w:val="595959"/>
-          <w:sz w:val="18"/>
-        </w:rPr>
-        <w:t>Figure 2. Task 2 initial implementation flowchart.</w:t>
-      </w:r>
-    </w:p>
-    <w:p>
-      <w:r>
-        <w:br w:type="page"/>
-      </w:r>
-    </w:p>
-    <w:p>
-      <w:pPr>
-        <w:jc w:val="center"/>
-      </w:pPr>
-      <w:r>
+        <w:spacing w:line="259" w:lineRule="auto"/>
+        <w:jc w:val="both"/>
+        <w:rPr>
+          <w:color w:val="000000" w:themeColor="text1"/>
+          <w:lang w:val="en-US" w:eastAsia="zh-CN"/>
+        </w:rPr>
+      </w:pPr>
+    </w:p>
+    <w:p>
+      <w:pPr>
+        <w:spacing w:line="259" w:lineRule="auto"/>
+        <w:jc w:val="both"/>
+        <w:rPr>
+          <w:color w:val="000000" w:themeColor="text1"/>
+          <w:lang w:val="en-US" w:eastAsia="zh-CN"/>
+        </w:rPr>
+      </w:pPr>
+    </w:p>
+    <w:p>
+      <w:pPr>
+        <w:spacing w:line="259" w:lineRule="auto"/>
+        <w:jc w:val="both"/>
+        <w:rPr>
+          <w:color w:val="000000" w:themeColor="text1"/>
+          <w:lang w:val="en-US" w:eastAsia="zh-CN"/>
+        </w:rPr>
+      </w:pPr>
+    </w:p>
+    <w:p>
+      <w:pPr>
+        <w:spacing w:line="259" w:lineRule="auto"/>
+        <w:jc w:val="both"/>
+        <w:rPr>
+          <w:color w:val="000000" w:themeColor="text1"/>
+          <w:lang w:val="en-US" w:eastAsia="zh-CN"/>
+        </w:rPr>
+      </w:pPr>
+    </w:p>
+    <w:p>
+      <w:pPr>
+        <w:spacing w:line="259" w:lineRule="auto"/>
+        <w:jc w:val="both"/>
+        <w:rPr>
+          <w:color w:val="000000" w:themeColor="text1"/>
+          <w:lang w:val="en-US" w:eastAsia="zh-CN"/>
+        </w:rPr>
+      </w:pPr>
+    </w:p>
+    <w:p>
+      <w:pPr>
+        <w:spacing w:line="259" w:lineRule="auto"/>
+        <w:jc w:val="both"/>
+        <w:rPr>
+          <w:color w:val="000000" w:themeColor="text1"/>
+          <w:lang w:val="en-US" w:eastAsia="zh-CN"/>
+        </w:rPr>
+      </w:pPr>
+    </w:p>
+    <w:p>
+      <w:pPr>
+        <w:spacing w:line="259" w:lineRule="auto"/>
+        <w:jc w:val="both"/>
+        <w:rPr>
+          <w:color w:val="000000" w:themeColor="text1"/>
+          <w:highlight w:val="cyan"/>
+          <w:lang w:val="en-US" w:eastAsia="zh-CN"/>
+        </w:rPr>
+      </w:pPr>
+      <w:r>
+        <w:rPr>
+          <w:noProof/>
+        </w:rPr>
+        <mc:AlternateContent>
+          <mc:Choice Requires="wps">
+            <w:drawing>
+              <wp:anchor distT="0" distB="0" distL="114300" distR="114300" simplePos="0" relativeHeight="251669504" behindDoc="0" locked="0" layoutInCell="1" allowOverlap="1" wp14:anchorId="54782046" wp14:editId="7480E8B8">
+                <wp:simplePos x="0" y="0"/>
+                <wp:positionH relativeFrom="column">
+                  <wp:posOffset>38100</wp:posOffset>
+                </wp:positionH>
+                <wp:positionV relativeFrom="paragraph">
+                  <wp:posOffset>7862744</wp:posOffset>
+                </wp:positionV>
+                <wp:extent cx="5730875" cy="635"/>
+                <wp:effectExtent l="0" t="0" r="0" b="4445"/>
+                <wp:wrapTopAndBottom/>
+                <wp:docPr id="2092964805" name="文本框 1"/>
+                <wp:cNvGraphicFramePr/>
+                <a:graphic xmlns:a="http://schemas.openxmlformats.org/drawingml/2006/main">
+                  <a:graphicData uri="http://schemas.microsoft.com/office/word/2010/wordprocessingShape">
+                    <wps:wsp>
+                      <wps:cNvSpPr txBox="1"/>
+                      <wps:spPr>
+                        <a:xfrm>
+                          <a:off x="0" y="0"/>
+                          <a:ext cx="5730875" cy="635"/>
+                        </a:xfrm>
+                        <a:prstGeom prst="rect">
+                          <a:avLst/>
+                        </a:prstGeom>
+                        <a:solidFill>
+                          <a:prstClr val="white"/>
+                        </a:solidFill>
+                        <a:ln>
+                          <a:noFill/>
+                        </a:ln>
+                      </wps:spPr>
+                      <wps:txbx>
+                        <w:txbxContent>
+                          <w:p>
+                            <w:pPr>
+                              <w:pStyle w:val="ac"/>
+                              <w:rPr>
+                                <w:noProof/>
+                                <w:color w:val="000000" w:themeColor="text1"/>
+                              </w:rPr>
+                            </w:pPr>
+                            <w:r>
+                              <w:t xml:space="preserve">Figure </w:t>
+                            </w:r>
+                            <w:fldSimple w:instr=" SEQ Figure \* ARABIC ">
+                              <w:r>
+                                <w:rPr>
+                                  <w:noProof/>
+                                </w:rPr>
+                                <w:t>5</w:t>
+                              </w:r>
+                            </w:fldSimple>
+                            <w:r>
+                              <w:t xml:space="preserve"> Task 2 Flowchart 2</w:t>
+                            </w:r>
+                          </w:p>
+                        </w:txbxContent>
+                      </wps:txbx>
+                      <wps:bodyPr rot="0" spcFirstLastPara="0" vertOverflow="overflow" horzOverflow="overflow" vert="horz" wrap="square" lIns="0" tIns="0" rIns="0" bIns="0" numCol="1" spcCol="0" rtlCol="0" fromWordArt="0" anchor="t" anchorCtr="0" forceAA="0" compatLnSpc="1">
+                        <a:prstTxWarp prst="textNoShape">
+                          <a:avLst/>
+                        </a:prstTxWarp>
+                        <a:spAutoFit/>
+                      </wps:bodyPr>
+                    </wps:wsp>
+                  </a:graphicData>
+                </a:graphic>
+              </wp:anchor>
+            </w:drawing>
+          </mc:Choice>
+          <mc:Fallback>
+            <w:pict>
+              <v:shape w14:anchorId="54782046" id="_x0000_s1029" type="#_x0000_t202" style="position:absolute;left:0;text-align:left;margin-left:3pt;margin-top:619.1pt;width:451.25pt;height:.05pt;z-index:251669504;visibility:visible;mso-wrap-style:square;mso-wrap-distance-left:9pt;mso-wrap-distance-top:0;mso-wrap-distance-right:9pt;mso-wrap-distance-bottom:0;mso-position-horizontal:absolute;mso-position-horizontal-relative:text;mso-position-vertical:absolute;mso-position-vertical-relative:text;v-text-anchor:top" o:gfxdata="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" stroked="f">
+                <v:textbox style="mso-fit-shape-to-text:t" inset="0,0,0,0">
+                  <w:txbxContent>
+                    <w:p>
+                      <w:pPr>
+                        <w:pStyle w:val="ac"/>
+                        <w:rPr>
+                          <w:noProof/>
+                          <w:color w:val="000000" w:themeColor="text1"/>
+                        </w:rPr>
+                      </w:pPr>
+                      <w:r>
+                        <w:t xml:space="preserve">Figure </w:t>
+                      </w:r>
+                      <w:fldSimple w:instr=" SEQ Figure \* ARABIC ">
+                        <w:r>
+                          <w:rPr>
+                            <w:noProof/>
+                          </w:rPr>
+                          <w:t>5</w:t>
+                        </w:r>
+                      </w:fldSimple>
+                      <w:r>
+                        <w:t xml:space="preserve"> Task 2 Flowchart 2</w:t>
+                      </w:r>
+                    </w:p>
+                  </w:txbxContent>
+                </v:textbox>
+                <w10:wrap type="topAndBottom"/>
+              </v:shape>
+            </w:pict>
+          </mc:Fallback>
+        </mc:AlternateContent>
+      </w:r>
+      <w:r>
+        <w:rPr>
+          <w:noProof/>
+          <w:color w:val="000000" w:themeColor="text1"/>
+          <w:lang w:val="en-US" w:eastAsia="zh-CN"/>
+        </w:rPr>
         <w:drawing>
-          <wp:inline xmlns:a="http://schemas.openxmlformats.org/drawingml/2006/main" xmlns:pic="http://schemas.openxmlformats.org/drawingml/2006/picture">
-            <wp:extent cx="4680000" cy="6271787"/>
-            <wp:docPr id="3" name="Picture 3"/>
+          <wp:anchor distT="0" distB="0" distL="114300" distR="114300" simplePos="0" relativeHeight="251667456" behindDoc="0" locked="0" layoutInCell="1" allowOverlap="1" wp14:anchorId="19A764E7" wp14:editId="788D3CD3">
+            <wp:simplePos x="0" y="0"/>
+            <wp:positionH relativeFrom="column">
+              <wp:posOffset>-12526</wp:posOffset>
+            </wp:positionH>
+            <wp:positionV relativeFrom="paragraph">
+              <wp:posOffset>73956</wp:posOffset>
+            </wp:positionV>
+            <wp:extent cx="5731200" cy="7682400"/>
+            <wp:effectExtent l="0" t="0" r="0" b="1270"/>
+            <wp:wrapTopAndBottom/>
+            <wp:docPr id="1246726984" name="图片 6" descr="图示&#10;&#10;AI 生成的内容可能不正确。"/>
             <wp:cNvGraphicFramePr>
-              <a:graphicFrameLocks noChangeAspect="1"/>
+              <a:graphicFrameLocks xmlns:a="http://schemas.openxmlformats.org/drawingml/2006/main" noChangeAspect="1"/>
             </wp:cNvGraphicFramePr>
-            <a:graphic>
+            <a:graphic xmlns:a="http://schemas.openxmlformats.org/drawingml/2006/main">
               <a:graphicData uri="http://schemas.openxmlformats.org/drawingml/2006/picture">
-                <pic:pic>
+                <pic:pic xmlns:pic="http://schemas.openxmlformats.org/drawingml/2006/picture">
                   <pic:nvPicPr>
-                    <pic:cNvPr id="0" name="Task2_FlowChart_2.png"/>
+                    <pic:cNvPr id="1246726984" name="图片 6" descr="图示&#10;&#10;AI 生成的内容可能不正确。"/>
                     <pic:cNvPicPr/>
                   </pic:nvPicPr>
                   <pic:blipFill>
-                    <a:blip r:embed="rId16"/>
+                    <a:blip r:embed="rId12">
+                      <a:extLst>
+                        <a:ext uri="{28A0092B-C50C-407E-A947-70E740481C1C}">
+                          <a14:useLocalDpi xmlns:a14="http://schemas.microsoft.com/office/drawing/2010/main" val="0"/>
+                        </a:ext>
+                      </a:extLst>
+                    </a:blip>
                     <a:stretch>
                       <a:fillRect/>
                     </a:stretch>
@@ -749,94 +1685,185 @@
                   <pic:spPr>
                     <a:xfrm>
                       <a:off x="0" y="0"/>
-                      <a:ext cx="4680000" cy="6271787"/>
+                      <a:ext cx="5731200" cy="7682400"/>
                     </a:xfrm>
-                    <a:prstGeom prst="rect"/>
+                    <a:prstGeom prst="rect">
+                      <a:avLst/>
+                    </a:prstGeom>
                   </pic:spPr>
                 </pic:pic>
               </a:graphicData>
             </a:graphic>
-          </wp:inline>
+            <wp14:sizeRelH relativeFrom="margin">
+              <wp14:pctWidth>0</wp14:pctWidth>
+            </wp14:sizeRelH>
+            <wp14:sizeRelV relativeFrom="margin">
+              <wp14:pctHeight>0</wp14:pctHeight>
+            </wp14:sizeRelV>
+          </wp:anchor>
         </w:drawing>
       </w:r>
     </w:p>
     <w:p>
       <w:pPr>
-        <w:jc w:val="center"/>
-      </w:pPr>
-      <w:r>
-        <w:rPr>
-          <w:i/>
-          <w:color w:val="595959"/>
-          <w:sz w:val="18"/>
-        </w:rPr>
-        <w:t>Figure 3. Task 2 updated flowchart reflecting temp_monitor.m implementation.</w:t>
-      </w:r>
-    </w:p>
-    <w:tbl>
-      <w:tblPr>
-        <w:tblW w:type="auto" w:w="0"/>
-        <w:jc w:val="center"/>
-        <w:tblLook w:firstColumn="1" w:firstRow="1" w:lastColumn="0" w:lastRow="0" w:noHBand="0" w:noVBand="1" w:val="04A0"/>
-      </w:tblPr>
-      <w:tblGrid>
-        <w:gridCol w:w="9638"/>
-      </w:tblGrid>
-      <w:tr>
-        <w:tc>
-          <w:tcPr>
-            <w:tcW w:type="dxa" w:w="9638"/>
-            <w:shd w:fill="E2F0D9"/>
-          </w:tcPr>
-          <w:p>
-            <w:r>
-              <w:rPr>
-                <w:b/>
-              </w:rPr>
-              <w:t>Live plot snapshot required</w:t>
-            </w:r>
-            <w:r>
-              <w:br/>
-              <w:t>Insert a live Task 2 monitoring plot snapshot here after running temp_monitor.m, if available.</w:t>
-            </w:r>
-          </w:p>
-        </w:tc>
-      </w:tr>
-    </w:tbl>
-    <w:p>
-      <w:pPr>
-        <w:pStyle w:val="1"/>
-      </w:pPr>
-      <w:r>
-        <w:t>Task 3 - Temperature Prediction Algorithm</w:t>
-      </w:r>
-    </w:p>
-    <w:p>
-      <w:r>
-        <w:t>The function temp_prediction.m continuously calculates the temperature rate of change in C/s using a rolling-window linear regression. It prints the current temperature, rate of change, and predicted temperature after five minutes. The LED logic provides a red warning for rapid heating above +4 C/min, a yellow warning for rapid cooling below -4 C/min, and a green light when the temperature remains stable within the comfort range.</w:t>
-      </w:r>
-    </w:p>
-    <w:p>
-      <w:pPr>
-        <w:jc w:val="center"/>
-      </w:pPr>
-      <w:r>
+        <w:spacing w:line="259" w:lineRule="auto"/>
+        <w:jc w:val="both"/>
+        <w:rPr>
+          <w:color w:val="000000" w:themeColor="text1"/>
+          <w:highlight w:val="cyan"/>
+          <w:lang w:val="en-US" w:eastAsia="zh-CN"/>
+        </w:rPr>
+      </w:pPr>
+      <w:r>
+        <w:rPr>
+          <w:noProof/>
+        </w:rPr>
+        <w:lastRenderedPageBreak/>
+        <mc:AlternateContent>
+          <mc:Choice Requires="wps">
+            <w:drawing>
+              <wp:anchor distT="0" distB="0" distL="114300" distR="114300" simplePos="0" relativeHeight="251672576" behindDoc="0" locked="0" layoutInCell="1" allowOverlap="1" wp14:anchorId="6A6F95D3" wp14:editId="7C75595B">
+                <wp:simplePos x="0" y="0"/>
+                <wp:positionH relativeFrom="column">
+                  <wp:posOffset>0</wp:posOffset>
+                </wp:positionH>
+                <wp:positionV relativeFrom="paragraph">
+                  <wp:posOffset>3444240</wp:posOffset>
+                </wp:positionV>
+                <wp:extent cx="5730875" cy="635"/>
+                <wp:effectExtent l="0" t="0" r="0" b="12065"/>
+                <wp:wrapTopAndBottom/>
+                <wp:docPr id="56979896" name="文本框 1"/>
+                <wp:cNvGraphicFramePr/>
+                <a:graphic xmlns:a="http://schemas.openxmlformats.org/drawingml/2006/main">
+                  <a:graphicData uri="http://schemas.microsoft.com/office/word/2010/wordprocessingShape">
+                    <wps:wsp>
+                      <wps:cNvSpPr txBox="1"/>
+                      <wps:spPr>
+                        <a:xfrm>
+                          <a:off x="0" y="0"/>
+                          <a:ext cx="5730875" cy="635"/>
+                        </a:xfrm>
+                        <a:prstGeom prst="rect">
+                          <a:avLst/>
+                        </a:prstGeom>
+                        <a:solidFill>
+                          <a:prstClr val="white"/>
+                        </a:solidFill>
+                        <a:ln>
+                          <a:noFill/>
+                        </a:ln>
+                      </wps:spPr>
+                      <wps:txbx>
+                        <w:txbxContent>
+                          <w:p>
+                            <w:pPr>
+                              <w:pStyle w:val="ac"/>
+                              <w:rPr>
+                                <w:color w:val="000000" w:themeColor="text1"/>
+                              </w:rPr>
+                            </w:pPr>
+                            <w:r>
+                              <w:t xml:space="preserve">Figure </w:t>
+                            </w:r>
+                            <w:fldSimple w:instr=" SEQ Figure \* ARABIC ">
+                              <w:r>
+                                <w:rPr>
+                                  <w:noProof/>
+                                </w:rPr>
+                                <w:t>6</w:t>
+                              </w:r>
+                            </w:fldSimple>
+                            <w:r>
+                              <w:t xml:space="preserve"> Task 2 Live Plot Graph</w:t>
+                            </w:r>
+                          </w:p>
+                        </w:txbxContent>
+                      </wps:txbx>
+                      <wps:bodyPr rot="0" spcFirstLastPara="0" vertOverflow="overflow" horzOverflow="overflow" vert="horz" wrap="square" lIns="0" tIns="0" rIns="0" bIns="0" numCol="1" spcCol="0" rtlCol="0" fromWordArt="0" anchor="t" anchorCtr="0" forceAA="0" compatLnSpc="1">
+                        <a:prstTxWarp prst="textNoShape">
+                          <a:avLst/>
+                        </a:prstTxWarp>
+                        <a:spAutoFit/>
+                      </wps:bodyPr>
+                    </wps:wsp>
+                  </a:graphicData>
+                </a:graphic>
+              </wp:anchor>
+            </w:drawing>
+          </mc:Choice>
+          <mc:Fallback>
+            <w:pict>
+              <v:shape w14:anchorId="6A6F95D3" id="_x0000_s1030" type="#_x0000_t202" style="position:absolute;left:0;text-align:left;margin-left:0;margin-top:271.2pt;width:451.25pt;height:.05pt;z-index:251672576;visibility:visible;mso-wrap-style:square;mso-wrap-distance-left:9pt;mso-wrap-distance-top:0;mso-wrap-distance-right:9pt;mso-wrap-distance-bottom:0;mso-position-horizontal:absolute;mso-position-horizontal-relative:text;mso-position-vertical:absolute;mso-position-vertical-relative:text;v-text-anchor:top" o:gfxdata="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" stroked="f">
+                <v:textbox style="mso-fit-shape-to-text:t" inset="0,0,0,0">
+                  <w:txbxContent>
+                    <w:p>
+                      <w:pPr>
+                        <w:pStyle w:val="ac"/>
+                        <w:rPr>
+                          <w:color w:val="000000" w:themeColor="text1"/>
+                        </w:rPr>
+                      </w:pPr>
+                      <w:r>
+                        <w:t xml:space="preserve">Figure </w:t>
+                      </w:r>
+                      <w:fldSimple w:instr=" SEQ Figure \* ARABIC ">
+                        <w:r>
+                          <w:rPr>
+                            <w:noProof/>
+                          </w:rPr>
+                          <w:t>6</w:t>
+                        </w:r>
+                      </w:fldSimple>
+                      <w:r>
+                        <w:t xml:space="preserve"> Task 2 Live Plot Graph</w:t>
+                      </w:r>
+                    </w:p>
+                  </w:txbxContent>
+                </v:textbox>
+                <w10:wrap type="topAndBottom"/>
+              </v:shape>
+            </w:pict>
+          </mc:Fallback>
+        </mc:AlternateContent>
+      </w:r>
+      <w:r>
+        <w:rPr>
+          <w:noProof/>
+          <w:color w:val="000000" w:themeColor="text1"/>
+          <w:lang w:val="en-US" w:eastAsia="zh-CN"/>
+        </w:rPr>
         <w:drawing>
-          <wp:inline xmlns:a="http://schemas.openxmlformats.org/drawingml/2006/main" xmlns:pic="http://schemas.openxmlformats.org/drawingml/2006/picture">
-            <wp:extent cx="4860000" cy="6156000"/>
-            <wp:docPr id="4" name="Picture 4"/>
+          <wp:anchor distT="0" distB="0" distL="114300" distR="114300" simplePos="0" relativeHeight="251670528" behindDoc="0" locked="0" layoutInCell="1" allowOverlap="1" wp14:anchorId="72EE9A77" wp14:editId="4FD9DD52">
+            <wp:simplePos x="0" y="0"/>
+            <wp:positionH relativeFrom="column">
+              <wp:posOffset>0</wp:posOffset>
+            </wp:positionH>
+            <wp:positionV relativeFrom="paragraph">
+              <wp:posOffset>0</wp:posOffset>
+            </wp:positionV>
+            <wp:extent cx="5731200" cy="3387600"/>
+            <wp:effectExtent l="0" t="0" r="0" b="3810"/>
+            <wp:wrapTopAndBottom/>
+            <wp:docPr id="1640559567" name="图片 7" descr="图表, 折线图&#10;&#10;AI 生成的内容可能不正确。"/>
             <wp:cNvGraphicFramePr>
-              <a:graphicFrameLocks noChangeAspect="1"/>
+              <a:graphicFrameLocks xmlns:a="http://schemas.openxmlformats.org/drawingml/2006/main" noChangeAspect="1"/>
             </wp:cNvGraphicFramePr>
-            <a:graphic>
+            <a:graphic xmlns:a="http://schemas.openxmlformats.org/drawingml/2006/main">
               <a:graphicData uri="http://schemas.openxmlformats.org/drawingml/2006/picture">
-                <pic:pic>
+                <pic:pic xmlns:pic="http://schemas.openxmlformats.org/drawingml/2006/picture">
                   <pic:nvPicPr>
-                    <pic:cNvPr id="0" name="Task3_FlowChart.png"/>
+                    <pic:cNvPr id="1640559567" name="图片 7" descr="图表, 折线图&#10;&#10;AI 生成的内容可能不正确。"/>
                     <pic:cNvPicPr/>
                   </pic:nvPicPr>
                   <pic:blipFill>
-                    <a:blip r:embed="rId17"/>
+                    <a:blip r:embed="rId13" cstate="print">
+                      <a:extLst>
+                        <a:ext uri="{28A0092B-C50C-407E-A947-70E740481C1C}">
+                          <a14:useLocalDpi xmlns:a14="http://schemas.microsoft.com/office/drawing/2010/main" val="0"/>
+                        </a:ext>
+                      </a:extLst>
+                    </a:blip>
                     <a:stretch>
                       <a:fillRect/>
                     </a:stretch>
@@ -844,99 +1871,191 @@
                   <pic:spPr>
                     <a:xfrm>
                       <a:off x="0" y="0"/>
-                      <a:ext cx="4860000" cy="6156000"/>
+                      <a:ext cx="5731200" cy="3387600"/>
                     </a:xfrm>
-                    <a:prstGeom prst="rect"/>
+                    <a:prstGeom prst="rect">
+                      <a:avLst/>
+                    </a:prstGeom>
                   </pic:spPr>
                 </pic:pic>
               </a:graphicData>
             </a:graphic>
-          </wp:inline>
+            <wp14:sizeRelH relativeFrom="margin">
+              <wp14:pctWidth>0</wp14:pctWidth>
+            </wp14:sizeRelH>
+            <wp14:sizeRelV relativeFrom="margin">
+              <wp14:pctHeight>0</wp14:pctHeight>
+            </wp14:sizeRelV>
+          </wp:anchor>
         </w:drawing>
       </w:r>
     </w:p>
     <w:p>
       <w:pPr>
-        <w:jc w:val="center"/>
-      </w:pPr>
-      <w:r>
-        <w:rPr>
-          <w:i/>
-          <w:color w:val="595959"/>
-          <w:sz w:val="18"/>
-        </w:rPr>
-        <w:t>Figure 4. Task 3 prediction and warning algorithm flowchart.</w:t>
-      </w:r>
-    </w:p>
-    <w:p>
-      <w:pPr>
-        <w:pStyle w:val="1"/>
-      </w:pPr>
-      <w:r>
-        <w:t>Task 4 - Reflective Statement</w:t>
-      </w:r>
-    </w:p>
-    <w:p>
-      <w:r>
-        <w:t>This project strengthened my understanding of connecting MATLAB code to physical hardware through an Arduino interface. A key challenge was keeping the timing of sensor readings consistent while also making the LEDs blink at the required rates. The final Task 2 function addresses this by structuring the high-temperature red LED warning so that the blink interval is 0.25 s while the loop still remains close to a one-second acquisition cycle. Another challenge was reducing the effect of short-term sensor noise when predicting future temperature. In Task 3, a rolling-window linear regression was used to estimate the temperature gradient more reliably than using only two adjacent samples.</w:t>
+        <w:pStyle w:val="a0"/>
+        <w:numPr>
+          <w:ilvl w:val="0"/>
+          <w:numId w:val="5"/>
+        </w:numPr>
+        <w:jc w:val="both"/>
+        <w:rPr>
+          <w:color w:val="000000" w:themeColor="text1"/>
+          <w:highlight w:val="cyan"/>
+          <w:lang w:val="en-US" w:eastAsia="zh-CN"/>
+        </w:rPr>
+      </w:pPr>
+      <w:r>
+        <w:rPr>
+          <w:sz w:val="24"/>
+          <w:szCs w:val="24"/>
+          <w:highlight w:val="cyan"/>
+          <w:lang w:val="en-US" w:eastAsia="zh-CN"/>
+        </w:rPr>
+        <w:t xml:space="preserve">Task </w:t>
+      </w:r>
+      <w:r>
+        <w:rPr>
+          <w:sz w:val="24"/>
+          <w:szCs w:val="24"/>
+          <w:highlight w:val="cyan"/>
+          <w:lang w:val="en-US" w:eastAsia="zh-CN"/>
+        </w:rPr>
+        <w:t>3</w:t>
+      </w:r>
+      <w:r>
+        <w:rPr>
+          <w:sz w:val="24"/>
+          <w:szCs w:val="24"/>
+          <w:highlight w:val="cyan"/>
+          <w:lang w:val="en-US" w:eastAsia="zh-CN"/>
+        </w:rPr>
+        <w:t xml:space="preserve"> – Temperature </w:t>
+      </w:r>
+      <w:r>
+        <w:rPr>
+          <w:sz w:val="24"/>
+          <w:szCs w:val="24"/>
+          <w:highlight w:val="cyan"/>
+          <w:lang w:val="en-US" w:eastAsia="zh-CN"/>
+        </w:rPr>
+        <w:t>Prediction Algorithm</w:t>
+      </w:r>
+    </w:p>
+    <w:p>
+      <w:r>
+        <w:t xml:space="preserve">The function </w:t>
+      </w:r>
+      <w:proofErr w:type="spellStart"/>
+      <w:r>
+        <w:t>temp_prediction.m</w:t>
+      </w:r>
+      <w:proofErr w:type="spellEnd"/>
+      <w:r>
+        <w:t xml:space="preserve"> continuously calculates the temperature rate of change in C/s using a rolling-window linear regression. It prints the current temperature, rate of change, and predicted temperature after five minutes. The LED logic provides a red warning for rapid heating above +4 C/min, a yellow warning for rapid cooling below -4 C/min, and a green light when the temperature remains stable within the comfort range.</w:t>
+      </w:r>
+    </w:p>
+    <w:p/>
+    <w:p>
+      <w:pPr>
+        <w:pStyle w:val="a0"/>
+        <w:numPr>
+          <w:ilvl w:val="0"/>
+          <w:numId w:val="5"/>
+        </w:numPr>
+        <w:jc w:val="both"/>
+        <w:rPr>
+          <w:color w:val="000000" w:themeColor="text1"/>
+          <w:highlight w:val="cyan"/>
+          <w:lang w:val="en-US" w:eastAsia="zh-CN"/>
+        </w:rPr>
+      </w:pPr>
+      <w:r>
+        <w:rPr>
+          <w:sz w:val="24"/>
+          <w:szCs w:val="24"/>
+          <w:highlight w:val="cyan"/>
+          <w:lang w:val="en-US" w:eastAsia="zh-CN"/>
+        </w:rPr>
+        <w:t xml:space="preserve">Task </w:t>
+      </w:r>
+      <w:r>
+        <w:rPr>
+          <w:sz w:val="24"/>
+          <w:szCs w:val="24"/>
+          <w:highlight w:val="cyan"/>
+          <w:lang w:val="en-US" w:eastAsia="zh-CN"/>
+        </w:rPr>
+        <w:t>4 – Reflective Statement</w:t>
+      </w:r>
+    </w:p>
+    <w:p>
+      <w:r>
+        <w:t xml:space="preserve">This project strengthened my understanding of connecting MATLAB code to physical hardware through an Arduino interface. A key challenge was keeping the timing of sensor readings consistent while also making the LEDs blink at the required rates. The final Task 2 function addresses this by structuring the high-temperature red LED warning so that the blink interval is 0.25 s while the loop </w:t>
+      </w:r>
+      <w:proofErr w:type="gramStart"/>
+      <w:r>
+        <w:t>still remains</w:t>
+      </w:r>
+      <w:proofErr w:type="gramEnd"/>
+      <w:r>
+        <w:t xml:space="preserve"> close to a one-second acquisition cycle. Another challenge was reducing the effect of short-term sensor noise when predicting future temperature. In Task 3, a rolling-window linear regression was used to estimate the temperature gradient more reliably than using only two adjacent samples.</w:t>
+      </w:r>
+      <w:r>
         <w:br/>
-        <w:br/>
-        <w:t>The main strength of the project is that the work is separated into a main script and two reusable functions, making the monitoring and prediction behaviours easier to test and improve independently. The code also records historical temperature data, produces a plot, and writes a log file for later review. A limitation is that the measured values depend on sensor calibration, wiring quality, and environmental noise from the Arduino supply. Future improvements could include sensor calibration against a reference thermometer, adding error handling for disconnected hardware, saving live monitoring snapshots automatically, and using a clearer user interface to display warnings during the test.</w:t>
-      </w:r>
-    </w:p>
-    <w:p>
-      <w:pPr>
-        <w:pStyle w:val="1"/>
-      </w:pPr>
-      <w:r>
-        <w:t>AI Use Disclosure</w:t>
-      </w:r>
-    </w:p>
-    <w:p>
-      <w:r>
-        <w:t>AI assistance was used to review formatting, organise this Word document, and check that the written submission matched the coursework brief. The MATLAB implementation, hardware testing results, and final submission should be reviewed and verified by the student before submission.</w:t>
-      </w:r>
-    </w:p>
-    <w:p>
-      <w:pPr>
-        <w:pStyle w:val="1"/>
-      </w:pPr>
-      <w:r>
-        <w:t>Final Checklist</w:t>
-      </w:r>
-    </w:p>
-    <w:p>
-      <w:r>
-        <w:t>- Confirm real Task 1 breadboard photograph is inserted.</w:t>
-      </w:r>
-    </w:p>
-    <w:p>
-      <w:r>
-        <w:t>- Confirm real Task 2 three-LED breadboard photograph is inserted.</w:t>
-      </w:r>
-    </w:p>
-    <w:p>
-      <w:r>
-        <w:t>- Confirm a live Task 2 monitoring plot snapshot is inserted if required by the marker.</w:t>
-      </w:r>
-    </w:p>
-    <w:p>
-      <w:r>
-        <w:t>- Run the MATLAB files with the Arduino connected and verify the LEDs behave as described.</w:t>
-      </w:r>
-    </w:p>
-    <w:p>
-      <w:r>
-        <w:t>- Zip the local repository folder including the .git folder, MATLAB files, Word document, and supporting images.</w:t>
-      </w:r>
+      </w:r>
+    </w:p>
+    <w:p>
+      <w:pPr>
+        <w:pStyle w:val="a0"/>
+        <w:numPr>
+          <w:ilvl w:val="0"/>
+          <w:numId w:val="5"/>
+        </w:numPr>
+        <w:jc w:val="both"/>
+        <w:rPr>
+          <w:color w:val="000000" w:themeColor="text1"/>
+          <w:highlight w:val="cyan"/>
+          <w:lang w:val="en-US" w:eastAsia="zh-CN"/>
+        </w:rPr>
+      </w:pPr>
+      <w:r>
+        <w:rPr>
+          <w:sz w:val="24"/>
+          <w:szCs w:val="24"/>
+          <w:highlight w:val="cyan"/>
+          <w:lang w:val="en-US" w:eastAsia="zh-CN"/>
+        </w:rPr>
+        <w:t xml:space="preserve">AI Use </w:t>
+      </w:r>
+      <w:proofErr w:type="spellStart"/>
+      <w:r>
+        <w:rPr>
+          <w:sz w:val="24"/>
+          <w:szCs w:val="24"/>
+          <w:highlight w:val="cyan"/>
+          <w:lang w:val="en-US" w:eastAsia="zh-CN"/>
+        </w:rPr>
+        <w:t>Disclusure</w:t>
+      </w:r>
+      <w:proofErr w:type="spellEnd"/>
+    </w:p>
+    <w:p>
+      <w:pPr>
+        <w:jc w:val="both"/>
+        <w:rPr>
+          <w:color w:val="000000" w:themeColor="text1"/>
+          <w:highlight w:val="cyan"/>
+          <w:lang w:eastAsia="zh-CN"/>
+        </w:rPr>
+      </w:pPr>
     </w:p>
     <w:sectPr>
-      <w:headerReference w:type="default" r:id="rId8"/>
-      <w:footerReference w:type="default" r:id="rId9"/>
-      <w:headerReference w:type="first" r:id="rId10"/>
-      <w:footerReference w:type="first" r:id="rId11"/>
+      <w:headerReference w:type="default" r:id="rId14"/>
+      <w:footerReference w:type="default" r:id="rId15"/>
+      <w:headerReference w:type="first" r:id="rId16"/>
+      <w:footerReference w:type="first" r:id="rId17"/>
       <w:pgSz w:w="11906" w:h="16838"/>
-      <w:pgMar w:top="964" w:right="1134" w:bottom="964" w:left="1134" w:header="850" w:footer="708" w:gutter="0"/>
+      <w:pgMar w:top="1440" w:right="1440" w:bottom="1440" w:left="1440" w:header="850" w:footer="708" w:gutter="0"/>
       <w:cols w:space="708"/>
       <w:titlePg/>
       <w:docGrid w:linePitch="360"/>
@@ -1048,7 +2167,7 @@
             </mc:Choice>
             <mc:Fallback>
               <w:pict>
-                <v:line w14:anchorId="663DB2AF" id="Straight Connector 4" o:spid="_x0000_s1026" style="position:absolute;z-index:251658243;visibility:visible;mso-wrap-style:square;mso-wrap-distance-left:9pt;mso-wrap-distance-top:0;mso-wrap-distance-right:9pt;mso-wrap-distance-bottom:0;mso-position-horizontal:absolute;mso-position-horizontal-relative:text;mso-position-vertical:absolute;mso-position-vertical-relative:text" from="-.75pt,-10.2pt" to="454.5pt,-10.2pt" o:gfxdata="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" strokecolor="#4472c4 [3204]" strokeweight=".5pt">
+                <v:line w14:anchorId="7964B0D7" id="Straight Connector 4" o:spid="_x0000_s1026" style="position:absolute;z-index:251658243;visibility:visible;mso-wrap-style:square;mso-wrap-distance-left:9pt;mso-wrap-distance-top:0;mso-wrap-distance-right:9pt;mso-wrap-distance-bottom:0;mso-position-horizontal:absolute;mso-position-horizontal-relative:text;mso-position-vertical:absolute;mso-position-vertical-relative:text" from="-.75pt,-10.2pt" to="454.5pt,-10.2pt" o:gfxdata="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" strokecolor="#4472c4 [3204]" strokeweight=".5pt">
                   <v:stroke joinstyle="miter"/>
                 </v:line>
               </w:pict>
@@ -1095,28 +2214,8 @@
         <w:iCs/>
         <w:sz w:val="18"/>
         <w:szCs w:val="18"/>
-        <w:highlight w:val="yellow"/>
       </w:rPr>
-      <w:t>Your name</w:t>
-    </w:r>
-    <w:r>
-      <w:rPr>
-        <w:i/>
-        <w:iCs/>
-        <w:sz w:val="18"/>
-        <w:szCs w:val="18"/>
-        <w:highlight w:val="yellow"/>
-      </w:rPr>
-      <w:t>, student ID</w:t>
-    </w:r>
-    <w:r>
-      <w:rPr>
-        <w:i/>
-        <w:iCs/>
-        <w:sz w:val="18"/>
-        <w:szCs w:val="18"/>
-      </w:rPr>
-      <w:t xml:space="preserve"> </w:t>
+      <w:t>Shenteng MA, 20721362</w:t>
     </w:r>
   </w:p>
 </w:ftr>
@@ -1280,7 +2379,7 @@
               <v:stroke joinstyle="miter"/>
               <v:path gradientshapeok="t" o:connecttype="rect"/>
             </v:shapetype>
-            <v:shape id="Text Box 15" o:spid="_x0000_s1026" type="#_x0000_t202" style="position:absolute;margin-left:302.75pt;margin-top:-36.05pt;width:215.5pt;height:37pt;z-index:251658241;visibility:visible;mso-wrap-style:square;mso-width-percent:0;mso-height-percent:0;mso-wrap-distance-left:9pt;mso-wrap-distance-top:0;mso-wrap-distance-right:9pt;mso-wrap-distance-bottom:0;mso-position-horizontal:absolute;mso-position-horizontal-relative:text;mso-position-vertical:absolute;mso-position-vertical-relative:text;mso-width-percent:0;mso-height-percent:0;mso-width-relative:margin;mso-height-relative:margin;v-text-anchor:top" o:gfxdata="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" fillcolor="white [3201]" stroked="f" strokeweight=".5pt">
+            <v:shape id="Text Box 15" o:spid="_x0000_s1031" type="#_x0000_t202" style="position:absolute;margin-left:302.75pt;margin-top:-36.05pt;width:215.5pt;height:37pt;z-index:251658241;visibility:visible;mso-wrap-style:square;mso-width-percent:0;mso-height-percent:0;mso-wrap-distance-left:9pt;mso-wrap-distance-top:0;mso-wrap-distance-right:9pt;mso-wrap-distance-bottom:0;mso-position-horizontal:absolute;mso-position-horizontal-relative:text;mso-position-vertical:absolute;mso-position-vertical-relative:text;mso-width-percent:0;mso-height-percent:0;mso-width-relative:margin;mso-height-relative:margin;v-text-anchor:top" o:gfxdata="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" fillcolor="white [3201]" stroked="f" strokeweight=".5pt">
               <v:textbox>
                 <w:txbxContent>
                   <w:p>
@@ -1464,6 +2563,95 @@
     </w:lvl>
   </w:abstractNum>
   <w:abstractNum w:abstractNumId="1" w15:restartNumberingAfterBreak="0">
+    <w:nsid w:val="28520798"/>
+    <w:multiLevelType w:val="hybridMultilevel"/>
+    <w:tmpl w:val="AFE43F52"/>
+    <w:lvl w:ilvl="0" w:tplc="16AAE57E">
+      <w:start w:val="1"/>
+      <w:numFmt w:val="decimal"/>
+      <w:lvlText w:val="%1."/>
+      <w:lvlJc w:val="left"/>
+      <w:pPr>
+        <w:ind w:left="360" w:hanging="360"/>
+      </w:pPr>
+      <w:rPr>
+        <w:rFonts w:hint="default"/>
+      </w:rPr>
+    </w:lvl>
+    <w:lvl w:ilvl="1" w:tplc="04090019" w:tentative="1">
+      <w:start w:val="1"/>
+      <w:numFmt w:val="lowerLetter"/>
+      <w:lvlText w:val="%2)"/>
+      <w:lvlJc w:val="left"/>
+      <w:pPr>
+        <w:ind w:left="880" w:hanging="440"/>
+      </w:pPr>
+    </w:lvl>
+    <w:lvl w:ilvl="2" w:tplc="0409001B" w:tentative="1">
+      <w:start w:val="1"/>
+      <w:numFmt w:val="lowerRoman"/>
+      <w:lvlText w:val="%3."/>
+      <w:lvlJc w:val="right"/>
+      <w:pPr>
+        <w:ind w:left="1320" w:hanging="440"/>
+      </w:pPr>
+    </w:lvl>
+    <w:lvl w:ilvl="3" w:tplc="0409000F" w:tentative="1">
+      <w:start w:val="1"/>
+      <w:numFmt w:val="decimal"/>
+      <w:lvlText w:val="%4."/>
+      <w:lvlJc w:val="left"/>
+      <w:pPr>
+        <w:ind w:left="1760" w:hanging="440"/>
+      </w:pPr>
+    </w:lvl>
+    <w:lvl w:ilvl="4" w:tplc="04090019" w:tentative="1">
+      <w:start w:val="1"/>
+      <w:numFmt w:val="lowerLetter"/>
+      <w:lvlText w:val="%5)"/>
+      <w:lvlJc w:val="left"/>
+      <w:pPr>
+        <w:ind w:left="2200" w:hanging="440"/>
+      </w:pPr>
+    </w:lvl>
+    <w:lvl w:ilvl="5" w:tplc="0409001B" w:tentative="1">
+      <w:start w:val="1"/>
+      <w:numFmt w:val="lowerRoman"/>
+      <w:lvlText w:val="%6."/>
+      <w:lvlJc w:val="right"/>
+      <w:pPr>
+        <w:ind w:left="2640" w:hanging="440"/>
+      </w:pPr>
+    </w:lvl>
+    <w:lvl w:ilvl="6" w:tplc="0409000F" w:tentative="1">
+      <w:start w:val="1"/>
+      <w:numFmt w:val="decimal"/>
+      <w:lvlText w:val="%7."/>
+      <w:lvlJc w:val="left"/>
+      <w:pPr>
+        <w:ind w:left="3080" w:hanging="440"/>
+      </w:pPr>
+    </w:lvl>
+    <w:lvl w:ilvl="7" w:tplc="04090019" w:tentative="1">
+      <w:start w:val="1"/>
+      <w:numFmt w:val="lowerLetter"/>
+      <w:lvlText w:val="%8)"/>
+      <w:lvlJc w:val="left"/>
+      <w:pPr>
+        <w:ind w:left="3520" w:hanging="440"/>
+      </w:pPr>
+    </w:lvl>
+    <w:lvl w:ilvl="8" w:tplc="0409001B" w:tentative="1">
+      <w:start w:val="1"/>
+      <w:numFmt w:val="lowerRoman"/>
+      <w:lvlText w:val="%9."/>
+      <w:lvlJc w:val="right"/>
+      <w:pPr>
+        <w:ind w:left="3960" w:hanging="440"/>
+      </w:pPr>
+    </w:lvl>
+  </w:abstractNum>
+  <w:abstractNum w:abstractNumId="2" w15:restartNumberingAfterBreak="0">
     <w:nsid w:val="49D82E44"/>
     <w:multiLevelType w:val="multilevel"/>
     <w:tmpl w:val="6B982794"/>
@@ -1551,7 +2739,7 @@
       </w:pPr>
     </w:lvl>
   </w:abstractNum>
-  <w:abstractNum w:abstractNumId="2" w15:restartNumberingAfterBreak="0">
+  <w:abstractNum w:abstractNumId="3" w15:restartNumberingAfterBreak="0">
     <w:nsid w:val="509A57DD"/>
     <w:multiLevelType w:val="hybridMultilevel"/>
     <w:tmpl w:val="25F4533C"/>
@@ -1664,7 +2852,7 @@
       </w:rPr>
     </w:lvl>
   </w:abstractNum>
-  <w:abstractNum w:abstractNumId="3" w15:restartNumberingAfterBreak="0">
+  <w:abstractNum w:abstractNumId="4" w15:restartNumberingAfterBreak="0">
     <w:nsid w:val="54237D38"/>
     <w:multiLevelType w:val="hybridMultilevel"/>
     <w:tmpl w:val="2828F10A"/>
@@ -1778,16 +2966,19 @@
     </w:lvl>
   </w:abstractNum>
   <w:num w:numId="1" w16cid:durableId="1827822957">
-    <w:abstractNumId w:val="1"/>
+    <w:abstractNumId w:val="2"/>
   </w:num>
   <w:num w:numId="2" w16cid:durableId="907231765">
     <w:abstractNumId w:val="0"/>
   </w:num>
   <w:num w:numId="3" w16cid:durableId="1932926543">
-    <w:abstractNumId w:val="2"/>
+    <w:abstractNumId w:val="3"/>
   </w:num>
   <w:num w:numId="4" w16cid:durableId="401878016">
-    <w:abstractNumId w:val="3"/>
+    <w:abstractNumId w:val="4"/>
+  </w:num>
+  <w:num w:numId="5" w16cid:durableId="412510835">
+    <w:abstractNumId w:val="1"/>
   </w:num>
 </w:numbering>
 </file>
@@ -2190,13 +3381,12 @@
   <w:style w:type="paragraph" w:default="1" w:styleId="a">
     <w:name w:val="Normal"/>
     <w:qFormat/>
-    <w:rsid w:val="005072DF"/>
+    <w:rsid w:val="00912977"/>
     <w:pPr>
       <w:spacing w:line="312" w:lineRule="auto"/>
     </w:pPr>
     <w:rPr>
-      <w:rFonts w:ascii="Calibri" w:hAnsi="Calibri" w:cs="Arial" w:eastAsia="Calibri"/>
-      <w:sz w:val="21"/>
+      <w:rFonts w:ascii="Arial" w:hAnsi="Arial" w:cs="Arial"/>
     </w:rPr>
   </w:style>
   <w:style w:type="paragraph" w:styleId="1">
@@ -2216,11 +3406,9 @@
       <w:outlineLvl w:val="0"/>
     </w:pPr>
     <w:rPr>
-      <w:rFonts w:ascii="Calibri" w:hAnsi="Calibri" w:eastAsia="Calibri"/>
       <w:b/>
       <w:bCs/>
-      <w:color w:val="1F4E79"/>
-      <w:sz w:val="30"/>
+      <w:sz w:val="28"/>
       <w:szCs w:val="28"/>
     </w:rPr>
   </w:style>
@@ -2242,9 +3430,7 @@
       <w:outlineLvl w:val="1"/>
     </w:pPr>
     <w:rPr>
-      <w:rFonts w:ascii="Calibri" w:hAnsi="Calibri" w:eastAsia="Calibri"/>
-      <w:color w:val="444444"/>
-      <w:sz w:val="25"/>
+      <w:sz w:val="22"/>
       <w:szCs w:val="22"/>
     </w:rPr>
   </w:style>
@@ -2331,11 +3517,9 @@
       <w:spacing w:after="240"/>
     </w:pPr>
     <w:rPr>
-      <w:rFonts w:ascii="Calibri" w:hAnsi="Calibri" w:eastAsia="Calibri"/>
       <w:b/>
       <w:bCs/>
-      <w:color w:val="1F4E79"/>
-      <w:sz w:val="40"/>
+      <w:sz w:val="28"/>
       <w:szCs w:val="28"/>
     </w:rPr>
   </w:style>

</xml_diff>